<commit_message>
Fix xuanbiyi China diplomacy bucket
</commit_message>
<xml_diff>
--- a/reports/选必一_哲学宝典式重建_2026-05-16/06_final_handbook/选必一_当代国际政治与经济_主观题术语宝典_考前导航版.docx
+++ b/reports/选必一_哲学宝典式重建_2026-05-16/06_final_handbook/选必一_当代国际政治与经济_主观题术语宝典_考前导航版.docx
@@ -664,6 +664,20 @@
         <w:t>“正确义利观”只有在细则明确列入国家利益角度、理论逻辑或合作基础可选表达时才放在本桶；设问重心是中国行动、中国担当、发展合作、共享机遇或发展中国家民生时归入“中国”桶。</w:t>
       </w:r>
     </w:p>
+    <w:p>
+      <w:pPr>
+        <w:pStyle w:val="ListBullet"/>
+        <w:spacing w:after="40"/>
+        <w:ind w:left="369"/>
+      </w:pPr>
+      <w:r>
+        <w:rPr>
+          <w:rFonts w:ascii="Microsoft YaHei" w:hAnsi="Microsoft YaHei" w:eastAsia="Microsoft YaHei"/>
+          <w:sz w:val="18"/>
+        </w:rPr>
+        <w:t>“独立自主和平外交政策”“和平共处五项原则”“独立自主的基本立场”属于中国外交政策链，统一归入“中国”桶；技术、产业链语境中的“独立自主、自力更生、自主可控”也归入“中国”桶，不放在理论桶。</w:t>
+      </w:r>
+    </w:p>
     <w:tbl>
       <w:tblPr>
         <w:tblStyle w:val="TableGrid"/>
@@ -904,7 +918,7 @@
                 <w:rFonts w:ascii="Microsoft YaHei" w:hAnsi="Microsoft YaHei" w:eastAsia="Microsoft YaHei"/>
                 <w:sz w:val="16"/>
               </w:rPr>
-              <w:t>6</w:t>
+              <w:t>5</w:t>
             </w:r>
           </w:p>
         </w:tc>
@@ -1199,98 +1213,6 @@
                 <w:sz w:val="16"/>
               </w:rPr>
               <w:t>我国的未来产业面临激烈的国际竞争，需要加强风险应对和防范；当前国际竞争的实质是以经济和科技实力为基础的综合国力较量</w:t>
-            </w:r>
-          </w:p>
-        </w:tc>
-        <w:tc>
-          <w:tcPr>
-            <w:tcW w:type="dxa" w:w="3096"/>
-          </w:tcPr>
-          <w:p>
-            <w:pPr>
-              <w:spacing w:after="0"/>
-            </w:pPr>
-            <w:r/>
-            <w:r>
-              <w:rPr>
-                <w:rFonts w:ascii="Microsoft YaHei" w:hAnsi="Microsoft YaHei" w:eastAsia="Microsoft YaHei"/>
-                <w:sz w:val="16"/>
-              </w:rPr>
-              <w:t>同名二级标题</w:t>
-            </w:r>
-          </w:p>
-        </w:tc>
-        <w:tc>
-          <w:tcPr>
-            <w:tcW w:type="dxa" w:w="3096"/>
-          </w:tcPr>
-          <w:p>
-            <w:pPr>
-              <w:spacing w:after="0"/>
-            </w:pPr>
-            <w:r/>
-            <w:r>
-              <w:rPr>
-                <w:rFonts w:ascii="Microsoft YaHei" w:hAnsi="Microsoft YaHei" w:eastAsia="Microsoft YaHei"/>
-                <w:sz w:val="16"/>
-              </w:rPr>
-              <w:t>遇到原因、前提、深层逻辑，先判断它是不是背景或理论支撑。</w:t>
-            </w:r>
-          </w:p>
-        </w:tc>
-      </w:tr>
-      <w:tr>
-        <w:tc>
-          <w:tcPr>
-            <w:tcW w:type="dxa" w:w="3096"/>
-          </w:tcPr>
-          <w:p>
-            <w:pPr>
-              <w:spacing w:after="0"/>
-            </w:pPr>
-            <w:r/>
-            <w:r>
-              <w:rPr>
-                <w:rFonts w:ascii="Microsoft YaHei" w:hAnsi="Microsoft YaHei" w:eastAsia="Microsoft YaHei"/>
-                <w:sz w:val="16"/>
-              </w:rPr>
-              <w:t>独立自主和平外交与和平共处五项原则</w:t>
-            </w:r>
-          </w:p>
-        </w:tc>
-        <w:tc>
-          <w:tcPr>
-            <w:tcW w:type="dxa" w:w="3096"/>
-          </w:tcPr>
-          <w:p>
-            <w:pPr>
-              <w:spacing w:after="0"/>
-            </w:pPr>
-            <w:r/>
-            <w:r>
-              <w:rPr>
-                <w:rFonts w:ascii="Microsoft YaHei" w:hAnsi="Microsoft YaHei" w:eastAsia="Microsoft YaHei"/>
-                <w:sz w:val="16"/>
-              </w:rPr>
-              <w:t>3</w:t>
-            </w:r>
-          </w:p>
-        </w:tc>
-        <w:tc>
-          <w:tcPr>
-            <w:tcW w:type="dxa" w:w="3096"/>
-          </w:tcPr>
-          <w:p>
-            <w:pPr>
-              <w:spacing w:after="0"/>
-            </w:pPr>
-            <w:r/>
-            <w:r>
-              <w:rPr>
-                <w:rFonts w:ascii="Microsoft YaHei" w:hAnsi="Microsoft YaHei" w:eastAsia="Microsoft YaHei"/>
-                <w:sz w:val="16"/>
-              </w:rPr>
-              <w:t>坚持独立自主，增强自主创新能力，实现关键核心技术自主可控，把发展主动权牢牢掌握在自己手中</w:t>
             </w:r>
           </w:p>
         </w:tc>
@@ -7889,6 +7811,34 @@
           <w:rFonts w:ascii="Microsoft YaHei" w:hAnsi="Microsoft YaHei" w:eastAsia="Microsoft YaHei"/>
           <w:sz w:val="18"/>
         </w:rPr>
+        <w:t>中国外交政策链包括独立自主和平外交政策、独立自主的基本立场、和平共处五项原则、维护世界和平促进共同发展的宗旨和目标。</w:t>
+      </w:r>
+    </w:p>
+    <w:p>
+      <w:pPr>
+        <w:pStyle w:val="ListBullet"/>
+        <w:spacing w:after="40"/>
+        <w:ind w:left="369"/>
+      </w:pPr>
+      <w:r>
+        <w:rPr>
+          <w:rFonts w:ascii="Microsoft YaHei" w:hAnsi="Microsoft YaHei" w:eastAsia="Microsoft YaHei"/>
+          <w:sz w:val="18"/>
+        </w:rPr>
+        <w:t>技术、产业链、安全发展语境中的独立自主、自力更生、自主可控、发展主动权，属于中国如何行动和提升能力，不归入理论桶。</w:t>
+      </w:r>
+    </w:p>
+    <w:p>
+      <w:pPr>
+        <w:pStyle w:val="ListBullet"/>
+        <w:spacing w:after="40"/>
+        <w:ind w:left="369"/>
+      </w:pPr>
+      <w:r>
+        <w:rPr>
+          <w:rFonts w:ascii="Microsoft YaHei" w:hAnsi="Microsoft YaHei" w:eastAsia="Microsoft YaHei"/>
+          <w:sz w:val="18"/>
+        </w:rPr>
         <w:t>如果题目重心是国际秩序、全球治理原则或共同利益，不要把所有“有中国参与”的材料都归入本桶。</w:t>
       </w:r>
     </w:p>
@@ -8500,7 +8450,7 @@
                 <w:rFonts w:ascii="Microsoft YaHei" w:hAnsi="Microsoft YaHei" w:eastAsia="Microsoft YaHei"/>
                 <w:sz w:val="16"/>
               </w:rPr>
-              <w:t>4</w:t>
+              <w:t>6</w:t>
             </w:r>
           </w:p>
         </w:tc>
@@ -10131,6 +10081,98 @@
                 <w:sz w:val="16"/>
               </w:rPr>
               <w:t>主动担当全球气候治理责任；展现负责任大国担当</w:t>
+            </w:r>
+          </w:p>
+        </w:tc>
+        <w:tc>
+          <w:tcPr>
+            <w:tcW w:type="dxa" w:w="3096"/>
+          </w:tcPr>
+          <w:p>
+            <w:pPr>
+              <w:spacing w:after="0"/>
+            </w:pPr>
+            <w:r/>
+            <w:r>
+              <w:rPr>
+                <w:rFonts w:ascii="Microsoft YaHei" w:hAnsi="Microsoft YaHei" w:eastAsia="Microsoft YaHei"/>
+                <w:sz w:val="16"/>
+              </w:rPr>
+              <w:t>同名二级标题</w:t>
+            </w:r>
+          </w:p>
+        </w:tc>
+        <w:tc>
+          <w:tcPr>
+            <w:tcW w:type="dxa" w:w="3096"/>
+          </w:tcPr>
+          <w:p>
+            <w:pPr>
+              <w:spacing w:after="0"/>
+            </w:pPr>
+            <w:r/>
+            <w:r>
+              <w:rPr>
+                <w:rFonts w:ascii="Microsoft YaHei" w:hAnsi="Microsoft YaHei" w:eastAsia="Microsoft YaHei"/>
+                <w:sz w:val="16"/>
+              </w:rPr>
+              <w:t>遇到中国行动、中国方案、中国责任，先写中国定位和政策作用。</w:t>
+            </w:r>
+          </w:p>
+        </w:tc>
+      </w:tr>
+      <w:tr>
+        <w:tc>
+          <w:tcPr>
+            <w:tcW w:type="dxa" w:w="3096"/>
+          </w:tcPr>
+          <w:p>
+            <w:pPr>
+              <w:spacing w:after="0"/>
+            </w:pPr>
+            <w:r/>
+            <w:r>
+              <w:rPr>
+                <w:rFonts w:ascii="Microsoft YaHei" w:hAnsi="Microsoft YaHei" w:eastAsia="Microsoft YaHei"/>
+                <w:sz w:val="16"/>
+              </w:rPr>
+              <w:t>坚持独立自主、自力更生，增强发展主动权</w:t>
+            </w:r>
+          </w:p>
+        </w:tc>
+        <w:tc>
+          <w:tcPr>
+            <w:tcW w:type="dxa" w:w="3096"/>
+          </w:tcPr>
+          <w:p>
+            <w:pPr>
+              <w:spacing w:after="0"/>
+            </w:pPr>
+            <w:r/>
+            <w:r>
+              <w:rPr>
+                <w:rFonts w:ascii="Microsoft YaHei" w:hAnsi="Microsoft YaHei" w:eastAsia="Microsoft YaHei"/>
+                <w:sz w:val="16"/>
+              </w:rPr>
+              <w:t>2</w:t>
+            </w:r>
+          </w:p>
+        </w:tc>
+        <w:tc>
+          <w:tcPr>
+            <w:tcW w:type="dxa" w:w="3096"/>
+          </w:tcPr>
+          <w:p>
+            <w:pPr>
+              <w:spacing w:after="0"/>
+            </w:pPr>
+            <w:r/>
+            <w:r>
+              <w:rPr>
+                <w:rFonts w:ascii="Microsoft YaHei" w:hAnsi="Microsoft YaHei" w:eastAsia="Microsoft YaHei"/>
+                <w:sz w:val="16"/>
+              </w:rPr>
+              <w:t>坚持独立自主，增强自主创新能力，实现关键核心技术自主可控，把发展主动权牢牢掌握在自己手中</w:t>
             </w:r>
           </w:p>
         </w:tc>

</xml_diff>

<commit_message>
Fix xuanbiyi bucket audit classifications
</commit_message>
<xml_diff>
--- a/reports/选必一_哲学宝典式重建_2026-05-16/06_final_handbook/选必一_当代国际政治与经济_主观题术语宝典_考前导航版.docx
+++ b/reports/选必一_哲学宝典式重建_2026-05-16/06_final_handbook/选必一_当代国际政治与经济_主观题术语宝典_考前导航版.docx
@@ -444,98 +444,6 @@
                 <w:rFonts w:ascii="Microsoft YaHei" w:hAnsi="Microsoft YaHei" w:eastAsia="Microsoft YaHei"/>
                 <w:sz w:val="16"/>
               </w:rPr>
-              <w:t>我国的未来产业有非常广阔的国际市场，为未来产业“走出去”提供了可能</w:t>
-            </w:r>
-          </w:p>
-        </w:tc>
-        <w:tc>
-          <w:tcPr>
-            <w:tcW w:type="dxa" w:w="3096"/>
-          </w:tcPr>
-          <w:p>
-            <w:pPr>
-              <w:spacing w:after="0"/>
-            </w:pPr>
-            <w:r/>
-            <w:r>
-              <w:rPr>
-                <w:rFonts w:ascii="Microsoft YaHei" w:hAnsi="Microsoft YaHei" w:eastAsia="Microsoft YaHei"/>
-                <w:sz w:val="16"/>
-              </w:rPr>
-              <w:t>1</w:t>
-            </w:r>
-          </w:p>
-        </w:tc>
-        <w:tc>
-          <w:tcPr>
-            <w:tcW w:type="dxa" w:w="3096"/>
-          </w:tcPr>
-          <w:p>
-            <w:pPr>
-              <w:spacing w:after="0"/>
-            </w:pPr>
-            <w:r/>
-            <w:r>
-              <w:rPr>
-                <w:rFonts w:ascii="Microsoft YaHei" w:hAnsi="Microsoft YaHei" w:eastAsia="Microsoft YaHei"/>
-                <w:sz w:val="16"/>
-              </w:rPr>
-              <w:t>我国的未来产业有非常广阔的国际市场，为未来产业“走出去”提供了可能</w:t>
-            </w:r>
-          </w:p>
-        </w:tc>
-        <w:tc>
-          <w:tcPr>
-            <w:tcW w:type="dxa" w:w="3096"/>
-          </w:tcPr>
-          <w:p>
-            <w:pPr>
-              <w:spacing w:after="0"/>
-            </w:pPr>
-            <w:r/>
-            <w:r>
-              <w:rPr>
-                <w:rFonts w:ascii="Microsoft YaHei" w:hAnsi="Microsoft YaHei" w:eastAsia="Microsoft YaHei"/>
-                <w:sz w:val="16"/>
-              </w:rPr>
-              <w:t>同名二级标题</w:t>
-            </w:r>
-          </w:p>
-        </w:tc>
-        <w:tc>
-          <w:tcPr>
-            <w:tcW w:type="dxa" w:w="3096"/>
-          </w:tcPr>
-          <w:p>
-            <w:pPr>
-              <w:spacing w:after="0"/>
-            </w:pPr>
-            <w:r/>
-            <w:r>
-              <w:rPr>
-                <w:rFonts w:ascii="Microsoft YaHei" w:hAnsi="Microsoft YaHei" w:eastAsia="Microsoft YaHei"/>
-                <w:sz w:val="16"/>
-              </w:rPr>
-              <w:t>遇到原因、前提、深层逻辑，先判断它是不是背景或理论支撑。</w:t>
-            </w:r>
-          </w:p>
-        </w:tc>
-      </w:tr>
-      <w:tr>
-        <w:tc>
-          <w:tcPr>
-            <w:tcW w:type="dxa" w:w="3096"/>
-          </w:tcPr>
-          <w:p>
-            <w:pPr>
-              <w:spacing w:after="0"/>
-            </w:pPr>
-            <w:r/>
-            <w:r>
-              <w:rPr>
-                <w:rFonts w:ascii="Microsoft YaHei" w:hAnsi="Microsoft YaHei" w:eastAsia="Microsoft YaHei"/>
-                <w:sz w:val="16"/>
-              </w:rPr>
               <w:t>气候变化给全人类带来巨大风险和挑战，气候治理已成为全球治理的重要议题之一</w:t>
             </w:r>
           </w:p>
@@ -808,43 +716,43 @@
                 <w:rFonts w:ascii="Microsoft YaHei" w:hAnsi="Microsoft YaHei" w:eastAsia="Microsoft YaHei"/>
                 <w:sz w:val="16"/>
               </w:rPr>
-              <w:t>处理好发展和安全的关系 / 统筹发展和安全；总体国家安全观 / 底线思维 / 维护国家经济安全、科技安全 / 应对风险等；经济平稳可持续发展 / 高质量发展 / 注入新动能等</w:t>
-            </w:r>
-          </w:p>
-        </w:tc>
-        <w:tc>
-          <w:tcPr>
-            <w:tcW w:type="dxa" w:w="3096"/>
-          </w:tcPr>
-          <w:p>
-            <w:pPr>
-              <w:spacing w:after="0"/>
-            </w:pPr>
-            <w:r/>
-            <w:r>
-              <w:rPr>
-                <w:rFonts w:ascii="Microsoft YaHei" w:hAnsi="Microsoft YaHei" w:eastAsia="Microsoft YaHei"/>
-                <w:sz w:val="16"/>
-              </w:rPr>
-              <w:t>1</w:t>
-            </w:r>
-          </w:p>
-        </w:tc>
-        <w:tc>
-          <w:tcPr>
-            <w:tcW w:type="dxa" w:w="3096"/>
-          </w:tcPr>
-          <w:p>
-            <w:pPr>
-              <w:spacing w:after="0"/>
-            </w:pPr>
-            <w:r/>
-            <w:r>
-              <w:rPr>
-                <w:rFonts w:ascii="Microsoft YaHei" w:hAnsi="Microsoft YaHei" w:eastAsia="Microsoft YaHei"/>
-                <w:sz w:val="16"/>
-              </w:rPr>
-              <w:t>处理好发展和安全的关系 / 统筹发展和安全；总体国家安全观 / 底线思维 / 维护国家经济安全、科技安全 / 应对风险等；经济平稳可持续发展 / 高质量发展 / 注入新动能等</w:t>
+              <w:t>维护国家利益是主权国家对外活动的出发点和落脚点</w:t>
+            </w:r>
+          </w:p>
+        </w:tc>
+        <w:tc>
+          <w:tcPr>
+            <w:tcW w:type="dxa" w:w="3096"/>
+          </w:tcPr>
+          <w:p>
+            <w:pPr>
+              <w:spacing w:after="0"/>
+            </w:pPr>
+            <w:r/>
+            <w:r>
+              <w:rPr>
+                <w:rFonts w:ascii="Microsoft YaHei" w:hAnsi="Microsoft YaHei" w:eastAsia="Microsoft YaHei"/>
+                <w:sz w:val="16"/>
+              </w:rPr>
+              <w:t>5</w:t>
+            </w:r>
+          </w:p>
+        </w:tc>
+        <w:tc>
+          <w:tcPr>
+            <w:tcW w:type="dxa" w:w="3096"/>
+          </w:tcPr>
+          <w:p>
+            <w:pPr>
+              <w:spacing w:after="0"/>
+            </w:pPr>
+            <w:r/>
+            <w:r>
+              <w:rPr>
+                <w:rFonts w:ascii="Microsoft YaHei" w:hAnsi="Microsoft YaHei" w:eastAsia="Microsoft YaHei"/>
+                <w:sz w:val="16"/>
+              </w:rPr>
+              <w:t>国家利益 / 维护我国的主权、安全和发展利益</w:t>
             </w:r>
           </w:p>
         </w:tc>
@@ -900,43 +808,43 @@
                 <w:rFonts w:ascii="Microsoft YaHei" w:hAnsi="Microsoft YaHei" w:eastAsia="Microsoft YaHei"/>
                 <w:sz w:val="16"/>
               </w:rPr>
-              <w:t>维护国家利益是主权国家对外活动的出发点和落脚点</w:t>
-            </w:r>
-          </w:p>
-        </w:tc>
-        <w:tc>
-          <w:tcPr>
-            <w:tcW w:type="dxa" w:w="3096"/>
-          </w:tcPr>
-          <w:p>
-            <w:pPr>
-              <w:spacing w:after="0"/>
-            </w:pPr>
-            <w:r/>
-            <w:r>
-              <w:rPr>
-                <w:rFonts w:ascii="Microsoft YaHei" w:hAnsi="Microsoft YaHei" w:eastAsia="Microsoft YaHei"/>
-                <w:sz w:val="16"/>
-              </w:rPr>
-              <w:t>5</w:t>
-            </w:r>
-          </w:p>
-        </w:tc>
-        <w:tc>
-          <w:tcPr>
-            <w:tcW w:type="dxa" w:w="3096"/>
-          </w:tcPr>
-          <w:p>
-            <w:pPr>
-              <w:spacing w:after="0"/>
-            </w:pPr>
-            <w:r/>
-            <w:r>
-              <w:rPr>
-                <w:rFonts w:ascii="Microsoft YaHei" w:hAnsi="Microsoft YaHei" w:eastAsia="Microsoft YaHei"/>
-                <w:sz w:val="16"/>
-              </w:rPr>
-              <w:t>国家利益 / 维护我国的主权、安全和发展利益</w:t>
+              <w:t>国家间共同利益是国家合作的基础</w:t>
+            </w:r>
+          </w:p>
+        </w:tc>
+        <w:tc>
+          <w:tcPr>
+            <w:tcW w:type="dxa" w:w="3096"/>
+          </w:tcPr>
+          <w:p>
+            <w:pPr>
+              <w:spacing w:after="0"/>
+            </w:pPr>
+            <w:r/>
+            <w:r>
+              <w:rPr>
+                <w:rFonts w:ascii="Microsoft YaHei" w:hAnsi="Microsoft YaHei" w:eastAsia="Microsoft YaHei"/>
+                <w:sz w:val="16"/>
+              </w:rPr>
+              <w:t>4</w:t>
+            </w:r>
+          </w:p>
+        </w:tc>
+        <w:tc>
+          <w:tcPr>
+            <w:tcW w:type="dxa" w:w="3096"/>
+          </w:tcPr>
+          <w:p>
+            <w:pPr>
+              <w:spacing w:after="0"/>
+            </w:pPr>
+            <w:r/>
+            <w:r>
+              <w:rPr>
+                <w:rFonts w:ascii="Microsoft YaHei" w:hAnsi="Microsoft YaHei" w:eastAsia="Microsoft YaHei"/>
+                <w:sz w:val="16"/>
+              </w:rPr>
+              <w:t>共同利益是合作的基础</w:t>
             </w:r>
           </w:p>
         </w:tc>
@@ -992,43 +900,43 @@
                 <w:rFonts w:ascii="Microsoft YaHei" w:hAnsi="Microsoft YaHei" w:eastAsia="Microsoft YaHei"/>
                 <w:sz w:val="16"/>
               </w:rPr>
-              <w:t>国家间共同利益是国家合作的基础</w:t>
-            </w:r>
-          </w:p>
-        </w:tc>
-        <w:tc>
-          <w:tcPr>
-            <w:tcW w:type="dxa" w:w="3096"/>
-          </w:tcPr>
-          <w:p>
-            <w:pPr>
-              <w:spacing w:after="0"/>
-            </w:pPr>
-            <w:r/>
-            <w:r>
-              <w:rPr>
-                <w:rFonts w:ascii="Microsoft YaHei" w:hAnsi="Microsoft YaHei" w:eastAsia="Microsoft YaHei"/>
-                <w:sz w:val="16"/>
-              </w:rPr>
-              <w:t>4</w:t>
-            </w:r>
-          </w:p>
-        </w:tc>
-        <w:tc>
-          <w:tcPr>
-            <w:tcW w:type="dxa" w:w="3096"/>
-          </w:tcPr>
-          <w:p>
-            <w:pPr>
-              <w:spacing w:after="0"/>
-            </w:pPr>
-            <w:r/>
-            <w:r>
-              <w:rPr>
-                <w:rFonts w:ascii="Microsoft YaHei" w:hAnsi="Microsoft YaHei" w:eastAsia="Microsoft YaHei"/>
-                <w:sz w:val="16"/>
-              </w:rPr>
-              <w:t>共同利益是合作的基础</w:t>
+              <w:t>国际竞争的实质是综合国力较量</w:t>
+            </w:r>
+          </w:p>
+        </w:tc>
+        <w:tc>
+          <w:tcPr>
+            <w:tcW w:type="dxa" w:w="3096"/>
+          </w:tcPr>
+          <w:p>
+            <w:pPr>
+              <w:spacing w:after="0"/>
+            </w:pPr>
+            <w:r/>
+            <w:r>
+              <w:rPr>
+                <w:rFonts w:ascii="Microsoft YaHei" w:hAnsi="Microsoft YaHei" w:eastAsia="Microsoft YaHei"/>
+                <w:sz w:val="16"/>
+              </w:rPr>
+              <w:t>3</w:t>
+            </w:r>
+          </w:p>
+        </w:tc>
+        <w:tc>
+          <w:tcPr>
+            <w:tcW w:type="dxa" w:w="3096"/>
+          </w:tcPr>
+          <w:p>
+            <w:pPr>
+              <w:spacing w:after="0"/>
+            </w:pPr>
+            <w:r/>
+            <w:r>
+              <w:rPr>
+                <w:rFonts w:ascii="Microsoft YaHei" w:hAnsi="Microsoft YaHei" w:eastAsia="Microsoft YaHei"/>
+                <w:sz w:val="16"/>
+              </w:rPr>
+              <w:t>我国的未来产业面临激烈的国际竞争，需要加强风险应对和防范；当前国际竞争的实质是以经济和科技实力为基础的综合国力较量</w:t>
             </w:r>
           </w:p>
         </w:tc>
@@ -1084,7 +992,7 @@
                 <w:rFonts w:ascii="Microsoft YaHei" w:hAnsi="Microsoft YaHei" w:eastAsia="Microsoft YaHei"/>
                 <w:sz w:val="16"/>
               </w:rPr>
-              <w:t>经济安全 / 统筹安全与发展 / 多元稳定的经贸关系</w:t>
+              <w:t>正确义利观〔国家利益角度可选表述〕</w:t>
             </w:r>
           </w:p>
         </w:tc>
@@ -1120,7 +1028,7 @@
                 <w:rFonts w:ascii="Microsoft YaHei" w:hAnsi="Microsoft YaHei" w:eastAsia="Microsoft YaHei"/>
                 <w:sz w:val="16"/>
               </w:rPr>
-              <w:t>经济安全 / 统筹安全与发展 / 多元稳定的经贸关系</w:t>
+              <w:t>正确的义利观；正确义利观</w:t>
             </w:r>
           </w:p>
         </w:tc>
@@ -1156,375 +1064,7 @@
                 <w:rFonts w:ascii="Microsoft YaHei" w:hAnsi="Microsoft YaHei" w:eastAsia="Microsoft YaHei"/>
                 <w:sz w:val="16"/>
               </w:rPr>
-              <w:t>遇到原因、前提、深层逻辑，先判断它是不是背景或理论支撑。</w:t>
-            </w:r>
-          </w:p>
-        </w:tc>
-      </w:tr>
-      <w:tr>
-        <w:tc>
-          <w:tcPr>
-            <w:tcW w:type="dxa" w:w="3096"/>
-          </w:tcPr>
-          <w:p>
-            <w:pPr>
-              <w:spacing w:after="0"/>
-            </w:pPr>
-            <w:r/>
-            <w:r>
-              <w:rPr>
-                <w:rFonts w:ascii="Microsoft YaHei" w:hAnsi="Microsoft YaHei" w:eastAsia="Microsoft YaHei"/>
-                <w:sz w:val="16"/>
-              </w:rPr>
-              <w:t>国际竞争的实质是综合国力较量</w:t>
-            </w:r>
-          </w:p>
-        </w:tc>
-        <w:tc>
-          <w:tcPr>
-            <w:tcW w:type="dxa" w:w="3096"/>
-          </w:tcPr>
-          <w:p>
-            <w:pPr>
-              <w:spacing w:after="0"/>
-            </w:pPr>
-            <w:r/>
-            <w:r>
-              <w:rPr>
-                <w:rFonts w:ascii="Microsoft YaHei" w:hAnsi="Microsoft YaHei" w:eastAsia="Microsoft YaHei"/>
-                <w:sz w:val="16"/>
-              </w:rPr>
-              <w:t>3</w:t>
-            </w:r>
-          </w:p>
-        </w:tc>
-        <w:tc>
-          <w:tcPr>
-            <w:tcW w:type="dxa" w:w="3096"/>
-          </w:tcPr>
-          <w:p>
-            <w:pPr>
-              <w:spacing w:after="0"/>
-            </w:pPr>
-            <w:r/>
-            <w:r>
-              <w:rPr>
-                <w:rFonts w:ascii="Microsoft YaHei" w:hAnsi="Microsoft YaHei" w:eastAsia="Microsoft YaHei"/>
-                <w:sz w:val="16"/>
-              </w:rPr>
-              <w:t>我国的未来产业面临激烈的国际竞争，需要加强风险应对和防范；当前国际竞争的实质是以经济和科技实力为基础的综合国力较量</w:t>
-            </w:r>
-          </w:p>
-        </w:tc>
-        <w:tc>
-          <w:tcPr>
-            <w:tcW w:type="dxa" w:w="3096"/>
-          </w:tcPr>
-          <w:p>
-            <w:pPr>
-              <w:spacing w:after="0"/>
-            </w:pPr>
-            <w:r/>
-            <w:r>
-              <w:rPr>
-                <w:rFonts w:ascii="Microsoft YaHei" w:hAnsi="Microsoft YaHei" w:eastAsia="Microsoft YaHei"/>
-                <w:sz w:val="16"/>
-              </w:rPr>
-              <w:t>同名二级标题</w:t>
-            </w:r>
-          </w:p>
-        </w:tc>
-        <w:tc>
-          <w:tcPr>
-            <w:tcW w:type="dxa" w:w="3096"/>
-          </w:tcPr>
-          <w:p>
-            <w:pPr>
-              <w:spacing w:after="0"/>
-            </w:pPr>
-            <w:r/>
-            <w:r>
-              <w:rPr>
-                <w:rFonts w:ascii="Microsoft YaHei" w:hAnsi="Microsoft YaHei" w:eastAsia="Microsoft YaHei"/>
-                <w:sz w:val="16"/>
-              </w:rPr>
-              <w:t>遇到原因、前提、深层逻辑，先判断它是不是背景或理论支撑。</w:t>
-            </w:r>
-          </w:p>
-        </w:tc>
-      </w:tr>
-      <w:tr>
-        <w:tc>
-          <w:tcPr>
-            <w:tcW w:type="dxa" w:w="3096"/>
-          </w:tcPr>
-          <w:p>
-            <w:pPr>
-              <w:spacing w:after="0"/>
-            </w:pPr>
-            <w:r/>
-            <w:r>
-              <w:rPr>
-                <w:rFonts w:ascii="Microsoft YaHei" w:hAnsi="Microsoft YaHei" w:eastAsia="Microsoft YaHei"/>
-                <w:sz w:val="16"/>
-              </w:rPr>
-              <w:t>新中国外交始终服务于我国人民民主专政的国家性质；坚持党对外交统一集中领导</w:t>
-            </w:r>
-          </w:p>
-        </w:tc>
-        <w:tc>
-          <w:tcPr>
-            <w:tcW w:type="dxa" w:w="3096"/>
-          </w:tcPr>
-          <w:p>
-            <w:pPr>
-              <w:spacing w:after="0"/>
-            </w:pPr>
-            <w:r/>
-            <w:r>
-              <w:rPr>
-                <w:rFonts w:ascii="Microsoft YaHei" w:hAnsi="Microsoft YaHei" w:eastAsia="Microsoft YaHei"/>
-                <w:sz w:val="16"/>
-              </w:rPr>
-              <w:t>1</w:t>
-            </w:r>
-          </w:p>
-        </w:tc>
-        <w:tc>
-          <w:tcPr>
-            <w:tcW w:type="dxa" w:w="3096"/>
-          </w:tcPr>
-          <w:p>
-            <w:pPr>
-              <w:spacing w:after="0"/>
-            </w:pPr>
-            <w:r/>
-            <w:r>
-              <w:rPr>
-                <w:rFonts w:ascii="Microsoft YaHei" w:hAnsi="Microsoft YaHei" w:eastAsia="Microsoft YaHei"/>
-                <w:sz w:val="16"/>
-              </w:rPr>
-              <w:t>新中国外交始终服务于我国人民民主专政的国家性质；坚持党对外交统一集中领导</w:t>
-            </w:r>
-          </w:p>
-        </w:tc>
-        <w:tc>
-          <w:tcPr>
-            <w:tcW w:type="dxa" w:w="3096"/>
-          </w:tcPr>
-          <w:p>
-            <w:pPr>
-              <w:spacing w:after="0"/>
-            </w:pPr>
-            <w:r/>
-            <w:r>
-              <w:rPr>
-                <w:rFonts w:ascii="Microsoft YaHei" w:hAnsi="Microsoft YaHei" w:eastAsia="Microsoft YaHei"/>
-                <w:sz w:val="16"/>
-              </w:rPr>
-              <w:t>同名二级标题</w:t>
-            </w:r>
-          </w:p>
-        </w:tc>
-        <w:tc>
-          <w:tcPr>
-            <w:tcW w:type="dxa" w:w="3096"/>
-          </w:tcPr>
-          <w:p>
-            <w:pPr>
-              <w:spacing w:after="0"/>
-            </w:pPr>
-            <w:r/>
-            <w:r>
-              <w:rPr>
-                <w:rFonts w:ascii="Microsoft YaHei" w:hAnsi="Microsoft YaHei" w:eastAsia="Microsoft YaHei"/>
-                <w:sz w:val="16"/>
-              </w:rPr>
-              <w:t>遇到原因、前提、深层逻辑，先判断它是不是背景或理论支撑。</w:t>
-            </w:r>
-          </w:p>
-        </w:tc>
-      </w:tr>
-      <w:tr>
-        <w:tc>
-          <w:tcPr>
-            <w:tcW w:type="dxa" w:w="3096"/>
-          </w:tcPr>
-          <w:p>
-            <w:pPr>
-              <w:spacing w:after="0"/>
-            </w:pPr>
-            <w:r/>
-            <w:r>
-              <w:rPr>
-                <w:rFonts w:ascii="Microsoft YaHei" w:hAnsi="Microsoft YaHei" w:eastAsia="Microsoft YaHei"/>
-                <w:sz w:val="16"/>
-              </w:rPr>
-              <w:t>正确义利观〔国家利益角度可选表述〕</w:t>
-            </w:r>
-          </w:p>
-        </w:tc>
-        <w:tc>
-          <w:tcPr>
-            <w:tcW w:type="dxa" w:w="3096"/>
-          </w:tcPr>
-          <w:p>
-            <w:pPr>
-              <w:spacing w:after="0"/>
-            </w:pPr>
-            <w:r/>
-            <w:r>
-              <w:rPr>
-                <w:rFonts w:ascii="Microsoft YaHei" w:hAnsi="Microsoft YaHei" w:eastAsia="Microsoft YaHei"/>
-                <w:sz w:val="16"/>
-              </w:rPr>
-              <w:t>1</w:t>
-            </w:r>
-          </w:p>
-        </w:tc>
-        <w:tc>
-          <w:tcPr>
-            <w:tcW w:type="dxa" w:w="3096"/>
-          </w:tcPr>
-          <w:p>
-            <w:pPr>
-              <w:spacing w:after="0"/>
-            </w:pPr>
-            <w:r/>
-            <w:r>
-              <w:rPr>
-                <w:rFonts w:ascii="Microsoft YaHei" w:hAnsi="Microsoft YaHei" w:eastAsia="Microsoft YaHei"/>
-                <w:sz w:val="16"/>
-              </w:rPr>
-              <w:t>正确的义利观；正确义利观</w:t>
-            </w:r>
-          </w:p>
-        </w:tc>
-        <w:tc>
-          <w:tcPr>
-            <w:tcW w:type="dxa" w:w="3096"/>
-          </w:tcPr>
-          <w:p>
-            <w:pPr>
-              <w:spacing w:after="0"/>
-            </w:pPr>
-            <w:r/>
-            <w:r>
-              <w:rPr>
-                <w:rFonts w:ascii="Microsoft YaHei" w:hAnsi="Microsoft YaHei" w:eastAsia="Microsoft YaHei"/>
-                <w:sz w:val="16"/>
-              </w:rPr>
-              <w:t>同名二级标题</w:t>
-            </w:r>
-          </w:p>
-        </w:tc>
-        <w:tc>
-          <w:tcPr>
-            <w:tcW w:type="dxa" w:w="3096"/>
-          </w:tcPr>
-          <w:p>
-            <w:pPr>
-              <w:spacing w:after="0"/>
-            </w:pPr>
-            <w:r/>
-            <w:r>
-              <w:rPr>
-                <w:rFonts w:ascii="Microsoft YaHei" w:hAnsi="Microsoft YaHei" w:eastAsia="Microsoft YaHei"/>
-                <w:sz w:val="16"/>
-              </w:rPr>
               <w:t>只有细则明确把正确义利观列入国家利益角度、理论逻辑或合作基础可选表达时，才放在理论桶；中国行动、中国担当、发展合作、共享机遇或发展中国家民生统一归入中国桶。 遇到原因、前提、深层逻辑，先判断它是不是背景或理论支撑。</w:t>
-            </w:r>
-          </w:p>
-        </w:tc>
-      </w:tr>
-      <w:tr>
-        <w:tc>
-          <w:tcPr>
-            <w:tcW w:type="dxa" w:w="3096"/>
-          </w:tcPr>
-          <w:p>
-            <w:pPr>
-              <w:spacing w:after="0"/>
-            </w:pPr>
-            <w:r/>
-            <w:r>
-              <w:rPr>
-                <w:rFonts w:ascii="Microsoft YaHei" w:hAnsi="Microsoft YaHei" w:eastAsia="Microsoft YaHei"/>
-                <w:sz w:val="16"/>
-              </w:rPr>
-              <w:t>理念蕴含普遍价值，能够形成共识、促成合作和发展、应对全人类共同问题和共同挑战</w:t>
-            </w:r>
-          </w:p>
-        </w:tc>
-        <w:tc>
-          <w:tcPr>
-            <w:tcW w:type="dxa" w:w="3096"/>
-          </w:tcPr>
-          <w:p>
-            <w:pPr>
-              <w:spacing w:after="0"/>
-            </w:pPr>
-            <w:r/>
-            <w:r>
-              <w:rPr>
-                <w:rFonts w:ascii="Microsoft YaHei" w:hAnsi="Microsoft YaHei" w:eastAsia="Microsoft YaHei"/>
-                <w:sz w:val="16"/>
-              </w:rPr>
-              <w:t>1</w:t>
-            </w:r>
-          </w:p>
-        </w:tc>
-        <w:tc>
-          <w:tcPr>
-            <w:tcW w:type="dxa" w:w="3096"/>
-          </w:tcPr>
-          <w:p>
-            <w:pPr>
-              <w:spacing w:after="0"/>
-            </w:pPr>
-            <w:r/>
-            <w:r>
-              <w:rPr>
-                <w:rFonts w:ascii="Microsoft YaHei" w:hAnsi="Microsoft YaHei" w:eastAsia="Microsoft YaHei"/>
-                <w:sz w:val="16"/>
-              </w:rPr>
-              <w:t>理念蕴含普遍价值，能够形成共识、促成合作和发展、应对全人类共同问题和共同挑战</w:t>
-            </w:r>
-          </w:p>
-        </w:tc>
-        <w:tc>
-          <w:tcPr>
-            <w:tcW w:type="dxa" w:w="3096"/>
-          </w:tcPr>
-          <w:p>
-            <w:pPr>
-              <w:spacing w:after="0"/>
-            </w:pPr>
-            <w:r/>
-            <w:r>
-              <w:rPr>
-                <w:rFonts w:ascii="Microsoft YaHei" w:hAnsi="Microsoft YaHei" w:eastAsia="Microsoft YaHei"/>
-                <w:sz w:val="16"/>
-              </w:rPr>
-              <w:t>同名二级标题</w:t>
-            </w:r>
-          </w:p>
-        </w:tc>
-        <w:tc>
-          <w:tcPr>
-            <w:tcW w:type="dxa" w:w="3096"/>
-          </w:tcPr>
-          <w:p>
-            <w:pPr>
-              <w:spacing w:after="0"/>
-            </w:pPr>
-            <w:r/>
-            <w:r>
-              <w:rPr>
-                <w:rFonts w:ascii="Microsoft YaHei" w:hAnsi="Microsoft YaHei" w:eastAsia="Microsoft YaHei"/>
-                <w:sz w:val="16"/>
-              </w:rPr>
-              <w:t>遇到原因、前提、深层逻辑，先判断它是不是背景或理论支撑。</w:t>
             </w:r>
           </w:p>
         </w:tc>
@@ -2538,43 +2078,43 @@
                 <w:rFonts w:ascii="Microsoft YaHei" w:hAnsi="Microsoft YaHei" w:eastAsia="Microsoft YaHei"/>
                 <w:sz w:val="16"/>
               </w:rPr>
-              <w:t>推进贸易和投资自由化便利化</w:t>
-            </w:r>
-          </w:p>
-        </w:tc>
-        <w:tc>
-          <w:tcPr>
-            <w:tcW w:type="dxa" w:w="3096"/>
-          </w:tcPr>
-          <w:p>
-            <w:pPr>
-              <w:spacing w:after="0"/>
-            </w:pPr>
-            <w:r/>
-            <w:r>
-              <w:rPr>
-                <w:rFonts w:ascii="Microsoft YaHei" w:hAnsi="Microsoft YaHei" w:eastAsia="Microsoft YaHei"/>
-                <w:sz w:val="16"/>
-              </w:rPr>
-              <w:t>11</w:t>
-            </w:r>
-          </w:p>
-        </w:tc>
-        <w:tc>
-          <w:tcPr>
-            <w:tcW w:type="dxa" w:w="3096"/>
-          </w:tcPr>
-          <w:p>
-            <w:pPr>
-              <w:spacing w:after="0"/>
-            </w:pPr>
-            <w:r/>
-            <w:r>
-              <w:rPr>
-                <w:rFonts w:ascii="Microsoft YaHei" w:hAnsi="Microsoft YaHei" w:eastAsia="Microsoft YaHei"/>
-                <w:sz w:val="16"/>
-              </w:rPr>
-              <w:t>降低制度性交易成本 / 提高贸易效率；贸易投资便利化自由化 / 破除贸易壁垒</w:t>
+              <w:t>经济安全 / 统筹安全与发展 / 多元稳定的经贸关系</w:t>
+            </w:r>
+          </w:p>
+        </w:tc>
+        <w:tc>
+          <w:tcPr>
+            <w:tcW w:type="dxa" w:w="3096"/>
+          </w:tcPr>
+          <w:p>
+            <w:pPr>
+              <w:spacing w:after="0"/>
+            </w:pPr>
+            <w:r/>
+            <w:r>
+              <w:rPr>
+                <w:rFonts w:ascii="Microsoft YaHei" w:hAnsi="Microsoft YaHei" w:eastAsia="Microsoft YaHei"/>
+                <w:sz w:val="16"/>
+              </w:rPr>
+              <w:t>1</w:t>
+            </w:r>
+          </w:p>
+        </w:tc>
+        <w:tc>
+          <w:tcPr>
+            <w:tcW w:type="dxa" w:w="3096"/>
+          </w:tcPr>
+          <w:p>
+            <w:pPr>
+              <w:spacing w:after="0"/>
+            </w:pPr>
+            <w:r/>
+            <w:r>
+              <w:rPr>
+                <w:rFonts w:ascii="Microsoft YaHei" w:hAnsi="Microsoft YaHei" w:eastAsia="Microsoft YaHei"/>
+                <w:sz w:val="16"/>
+              </w:rPr>
+              <w:t>经济安全 / 统筹安全与发展 / 多元稳定的经贸关系</w:t>
             </w:r>
           </w:p>
         </w:tc>
@@ -2746,43 +2286,43 @@
                 <w:rFonts w:ascii="Microsoft YaHei" w:hAnsi="Microsoft YaHei" w:eastAsia="Microsoft YaHei"/>
                 <w:sz w:val="16"/>
               </w:rPr>
-              <w:t>发挥比较优势并打造国际竞争新优势</w:t>
-            </w:r>
-          </w:p>
-        </w:tc>
-        <w:tc>
-          <w:tcPr>
-            <w:tcW w:type="dxa" w:w="3096"/>
-          </w:tcPr>
-          <w:p>
-            <w:pPr>
-              <w:spacing w:after="0"/>
-            </w:pPr>
-            <w:r/>
-            <w:r>
-              <w:rPr>
-                <w:rFonts w:ascii="Microsoft YaHei" w:hAnsi="Microsoft YaHei" w:eastAsia="Microsoft YaHei"/>
-                <w:sz w:val="16"/>
-              </w:rPr>
-              <w:t>2</w:t>
-            </w:r>
-          </w:p>
-        </w:tc>
-        <w:tc>
-          <w:tcPr>
-            <w:tcW w:type="dxa" w:w="3096"/>
-          </w:tcPr>
-          <w:p>
-            <w:pPr>
-              <w:spacing w:after="0"/>
-            </w:pPr>
-            <w:r/>
-            <w:r>
-              <w:rPr>
-                <w:rFonts w:ascii="Microsoft YaHei" w:hAnsi="Microsoft YaHei" w:eastAsia="Microsoft YaHei"/>
-                <w:sz w:val="16"/>
-              </w:rPr>
-              <w:t>发挥比较优势 / 优势互补 / 深度加入国际分工</w:t>
+              <w:t>推进贸易和投资自由化便利化</w:t>
+            </w:r>
+          </w:p>
+        </w:tc>
+        <w:tc>
+          <w:tcPr>
+            <w:tcW w:type="dxa" w:w="3096"/>
+          </w:tcPr>
+          <w:p>
+            <w:pPr>
+              <w:spacing w:after="0"/>
+            </w:pPr>
+            <w:r/>
+            <w:r>
+              <w:rPr>
+                <w:rFonts w:ascii="Microsoft YaHei" w:hAnsi="Microsoft YaHei" w:eastAsia="Microsoft YaHei"/>
+                <w:sz w:val="16"/>
+              </w:rPr>
+              <w:t>11</w:t>
+            </w:r>
+          </w:p>
+        </w:tc>
+        <w:tc>
+          <w:tcPr>
+            <w:tcW w:type="dxa" w:w="3096"/>
+          </w:tcPr>
+          <w:p>
+            <w:pPr>
+              <w:spacing w:after="0"/>
+            </w:pPr>
+            <w:r/>
+            <w:r>
+              <w:rPr>
+                <w:rFonts w:ascii="Microsoft YaHei" w:hAnsi="Microsoft YaHei" w:eastAsia="Microsoft YaHei"/>
+                <w:sz w:val="16"/>
+              </w:rPr>
+              <w:t>降低制度性交易成本 / 提高贸易效率；贸易投资便利化自由化 / 破除贸易壁垒</w:t>
             </w:r>
           </w:p>
         </w:tc>
@@ -2838,43 +2378,43 @@
                 <w:rFonts w:ascii="Microsoft YaHei" w:hAnsi="Microsoft YaHei" w:eastAsia="Microsoft YaHei"/>
                 <w:sz w:val="16"/>
               </w:rPr>
-              <w:t>维护全球产业链供应链稳定畅通</w:t>
-            </w:r>
-          </w:p>
-        </w:tc>
-        <w:tc>
-          <w:tcPr>
-            <w:tcW w:type="dxa" w:w="3096"/>
-          </w:tcPr>
-          <w:p>
-            <w:pPr>
-              <w:spacing w:after="0"/>
-            </w:pPr>
-            <w:r/>
-            <w:r>
-              <w:rPr>
-                <w:rFonts w:ascii="Microsoft YaHei" w:hAnsi="Microsoft YaHei" w:eastAsia="Microsoft YaHei"/>
-                <w:sz w:val="16"/>
-              </w:rPr>
-              <w:t>5</w:t>
-            </w:r>
-          </w:p>
-        </w:tc>
-        <w:tc>
-          <w:tcPr>
-            <w:tcW w:type="dxa" w:w="3096"/>
-          </w:tcPr>
-          <w:p>
-            <w:pPr>
-              <w:spacing w:after="0"/>
-            </w:pPr>
-            <w:r/>
-            <w:r>
-              <w:rPr>
-                <w:rFonts w:ascii="Microsoft YaHei" w:hAnsi="Microsoft YaHei" w:eastAsia="Microsoft YaHei"/>
-                <w:sz w:val="16"/>
-              </w:rPr>
-              <w:t>当前国际竞争的实质是以经济和科技实力为基础的综合国力较量；为全球产业链供应链稳定提供坚实支撑</w:t>
+              <w:t>发挥比较优势并打造国际竞争新优势</w:t>
+            </w:r>
+          </w:p>
+        </w:tc>
+        <w:tc>
+          <w:tcPr>
+            <w:tcW w:type="dxa" w:w="3096"/>
+          </w:tcPr>
+          <w:p>
+            <w:pPr>
+              <w:spacing w:after="0"/>
+            </w:pPr>
+            <w:r/>
+            <w:r>
+              <w:rPr>
+                <w:rFonts w:ascii="Microsoft YaHei" w:hAnsi="Microsoft YaHei" w:eastAsia="Microsoft YaHei"/>
+                <w:sz w:val="16"/>
+              </w:rPr>
+              <w:t>2</w:t>
+            </w:r>
+          </w:p>
+        </w:tc>
+        <w:tc>
+          <w:tcPr>
+            <w:tcW w:type="dxa" w:w="3096"/>
+          </w:tcPr>
+          <w:p>
+            <w:pPr>
+              <w:spacing w:after="0"/>
+            </w:pPr>
+            <w:r/>
+            <w:r>
+              <w:rPr>
+                <w:rFonts w:ascii="Microsoft YaHei" w:hAnsi="Microsoft YaHei" w:eastAsia="Microsoft YaHei"/>
+                <w:sz w:val="16"/>
+              </w:rPr>
+              <w:t>发挥比较优势 / 优势互补 / 深度加入国际分工</w:t>
             </w:r>
           </w:p>
         </w:tc>
@@ -2930,43 +2470,43 @@
                 <w:rFonts w:ascii="Microsoft YaHei" w:hAnsi="Microsoft YaHei" w:eastAsia="Microsoft YaHei"/>
                 <w:sz w:val="16"/>
               </w:rPr>
-              <w:t>中国扩大高水平对外开放与制度型开放</w:t>
-            </w:r>
-          </w:p>
-        </w:tc>
-        <w:tc>
-          <w:tcPr>
-            <w:tcW w:type="dxa" w:w="3096"/>
-          </w:tcPr>
-          <w:p>
-            <w:pPr>
-              <w:spacing w:after="0"/>
-            </w:pPr>
-            <w:r/>
-            <w:r>
-              <w:rPr>
-                <w:rFonts w:ascii="Microsoft YaHei" w:hAnsi="Microsoft YaHei" w:eastAsia="Microsoft YaHei"/>
-                <w:sz w:val="16"/>
-              </w:rPr>
-              <w:t>7</w:t>
-            </w:r>
-          </w:p>
-        </w:tc>
-        <w:tc>
-          <w:tcPr>
-            <w:tcW w:type="dxa" w:w="3096"/>
-          </w:tcPr>
-          <w:p>
-            <w:pPr>
-              <w:spacing w:after="0"/>
-            </w:pPr>
-            <w:r/>
-            <w:r>
-              <w:rPr>
-                <w:rFonts w:ascii="Microsoft YaHei" w:hAnsi="Microsoft YaHei" w:eastAsia="Microsoft YaHei"/>
-                <w:sz w:val="16"/>
-              </w:rPr>
-              <w:t>中国坚定不移扩大高水平对外开放</w:t>
+              <w:t>维护全球产业链供应链稳定畅通</w:t>
+            </w:r>
+          </w:p>
+        </w:tc>
+        <w:tc>
+          <w:tcPr>
+            <w:tcW w:type="dxa" w:w="3096"/>
+          </w:tcPr>
+          <w:p>
+            <w:pPr>
+              <w:spacing w:after="0"/>
+            </w:pPr>
+            <w:r/>
+            <w:r>
+              <w:rPr>
+                <w:rFonts w:ascii="Microsoft YaHei" w:hAnsi="Microsoft YaHei" w:eastAsia="Microsoft YaHei"/>
+                <w:sz w:val="16"/>
+              </w:rPr>
+              <w:t>5</w:t>
+            </w:r>
+          </w:p>
+        </w:tc>
+        <w:tc>
+          <w:tcPr>
+            <w:tcW w:type="dxa" w:w="3096"/>
+          </w:tcPr>
+          <w:p>
+            <w:pPr>
+              <w:spacing w:after="0"/>
+            </w:pPr>
+            <w:r/>
+            <w:r>
+              <w:rPr>
+                <w:rFonts w:ascii="Microsoft YaHei" w:hAnsi="Microsoft YaHei" w:eastAsia="Microsoft YaHei"/>
+                <w:sz w:val="16"/>
+              </w:rPr>
+              <w:t>当前国际竞争的实质是以经济和科技实力为基础的综合国力较量；为全球产业链供应链稳定提供坚实支撑</w:t>
             </w:r>
           </w:p>
         </w:tc>
@@ -3022,43 +2562,43 @@
                 <w:rFonts w:ascii="Microsoft YaHei" w:hAnsi="Microsoft YaHei" w:eastAsia="Microsoft YaHei"/>
                 <w:sz w:val="16"/>
               </w:rPr>
-              <w:t>推动我国与周边国家的经济融合，促进共同发展 / 促进区域经济一体化</w:t>
-            </w:r>
-          </w:p>
-        </w:tc>
-        <w:tc>
-          <w:tcPr>
-            <w:tcW w:type="dxa" w:w="3096"/>
-          </w:tcPr>
-          <w:p>
-            <w:pPr>
-              <w:spacing w:after="0"/>
-            </w:pPr>
-            <w:r/>
-            <w:r>
-              <w:rPr>
-                <w:rFonts w:ascii="Microsoft YaHei" w:hAnsi="Microsoft YaHei" w:eastAsia="Microsoft YaHei"/>
-                <w:sz w:val="16"/>
-              </w:rPr>
-              <w:t>1</w:t>
-            </w:r>
-          </w:p>
-        </w:tc>
-        <w:tc>
-          <w:tcPr>
-            <w:tcW w:type="dxa" w:w="3096"/>
-          </w:tcPr>
-          <w:p>
-            <w:pPr>
-              <w:spacing w:after="0"/>
-            </w:pPr>
-            <w:r/>
-            <w:r>
-              <w:rPr>
-                <w:rFonts w:ascii="Microsoft YaHei" w:hAnsi="Microsoft YaHei" w:eastAsia="Microsoft YaHei"/>
-                <w:sz w:val="16"/>
-              </w:rPr>
-              <w:t>推动我国与周边国家的经济融合，促进共同发展 / 促进区域经济一体化</w:t>
+              <w:t>中国扩大高水平对外开放与制度型开放</w:t>
+            </w:r>
+          </w:p>
+        </w:tc>
+        <w:tc>
+          <w:tcPr>
+            <w:tcW w:type="dxa" w:w="3096"/>
+          </w:tcPr>
+          <w:p>
+            <w:pPr>
+              <w:spacing w:after="0"/>
+            </w:pPr>
+            <w:r/>
+            <w:r>
+              <w:rPr>
+                <w:rFonts w:ascii="Microsoft YaHei" w:hAnsi="Microsoft YaHei" w:eastAsia="Microsoft YaHei"/>
+                <w:sz w:val="16"/>
+              </w:rPr>
+              <w:t>7</w:t>
+            </w:r>
+          </w:p>
+        </w:tc>
+        <w:tc>
+          <w:tcPr>
+            <w:tcW w:type="dxa" w:w="3096"/>
+          </w:tcPr>
+          <w:p>
+            <w:pPr>
+              <w:spacing w:after="0"/>
+            </w:pPr>
+            <w:r/>
+            <w:r>
+              <w:rPr>
+                <w:rFonts w:ascii="Microsoft YaHei" w:hAnsi="Microsoft YaHei" w:eastAsia="Microsoft YaHei"/>
+                <w:sz w:val="16"/>
+              </w:rPr>
+              <w:t>中国坚定不移扩大高水平对外开放</w:t>
             </w:r>
           </w:p>
         </w:tc>
@@ -3114,7 +2654,7 @@
                 <w:rFonts w:ascii="Microsoft YaHei" w:hAnsi="Microsoft YaHei" w:eastAsia="Microsoft YaHei"/>
                 <w:sz w:val="16"/>
               </w:rPr>
-              <w:t>坚持多边贸易、多边主义与全球经济治理体系改革</w:t>
+              <w:t>推动我国与周边国家的经济融合，促进共同发展 / 促进区域经济一体化</w:t>
             </w:r>
           </w:p>
         </w:tc>
@@ -3150,7 +2690,7 @@
                 <w:rFonts w:ascii="Microsoft YaHei" w:hAnsi="Microsoft YaHei" w:eastAsia="Microsoft YaHei"/>
                 <w:sz w:val="16"/>
               </w:rPr>
-              <w:t>坚持多边贸易 / 多边主义 / 全球经济治理体系改革</w:t>
+              <w:t>推动我国与周边国家的经济融合，促进共同发展 / 促进区域经济一体化</w:t>
             </w:r>
           </w:p>
         </w:tc>
@@ -3206,7 +2746,7 @@
                 <w:rFonts w:ascii="Microsoft YaHei" w:hAnsi="Microsoft YaHei" w:eastAsia="Microsoft YaHei"/>
                 <w:sz w:val="16"/>
               </w:rPr>
-              <w:t>提升发展中国家的代表性和发言权，打破规则制定垄断</w:t>
+              <w:t>坚持多边贸易、多边主义与全球经济治理体系改革</w:t>
             </w:r>
           </w:p>
         </w:tc>
@@ -3242,7 +2782,7 @@
                 <w:rFonts w:ascii="Microsoft YaHei" w:hAnsi="Microsoft YaHei" w:eastAsia="Microsoft YaHei"/>
                 <w:sz w:val="16"/>
               </w:rPr>
-              <w:t>提升发展中国家的代表性和发言权 / 打破发达国家规则制定中的垄断主导</w:t>
+              <w:t>坚持多边贸易 / 多边主义 / 全球经济治理体系改革</w:t>
             </w:r>
           </w:p>
         </w:tc>
@@ -3278,7 +2818,7 @@
                 <w:rFonts w:ascii="Microsoft YaHei" w:hAnsi="Microsoft YaHei" w:eastAsia="Microsoft YaHei"/>
                 <w:sz w:val="16"/>
               </w:rPr>
-              <w:t>本节点只保留自贸区、数字经济规则、标准制定和经贸合作中的规则代表性；若设问主问国际秩序公正合理，应回到政治多极化。 遇到贸易、投资、市场、供应链、规则和开放合作，优先从全球化机制写。</w:t>
+              <w:t>遇到贸易、投资、市场、供应链、规则和开放合作，优先从全球化机制写。</w:t>
             </w:r>
           </w:p>
         </w:tc>
@@ -3298,43 +2838,43 @@
                 <w:rFonts w:ascii="Microsoft YaHei" w:hAnsi="Microsoft YaHei" w:eastAsia="Microsoft YaHei"/>
                 <w:sz w:val="16"/>
               </w:rPr>
-              <w:t>对接国际高标准经贸规则，参与国际标准和相关贸易规则制定，提升规则话语权</w:t>
-            </w:r>
-          </w:p>
-        </w:tc>
-        <w:tc>
-          <w:tcPr>
-            <w:tcW w:type="dxa" w:w="3096"/>
-          </w:tcPr>
-          <w:p>
-            <w:pPr>
-              <w:spacing w:after="0"/>
-            </w:pPr>
-            <w:r/>
-            <w:r>
-              <w:rPr>
-                <w:rFonts w:ascii="Microsoft YaHei" w:hAnsi="Microsoft YaHei" w:eastAsia="Microsoft YaHei"/>
-                <w:sz w:val="16"/>
-              </w:rPr>
-              <w:t>3</w:t>
-            </w:r>
-          </w:p>
-        </w:tc>
-        <w:tc>
-          <w:tcPr>
-            <w:tcW w:type="dxa" w:w="3096"/>
-          </w:tcPr>
-          <w:p>
-            <w:pPr>
-              <w:spacing w:after="0"/>
-            </w:pPr>
-            <w:r/>
-            <w:r>
-              <w:rPr>
-                <w:rFonts w:ascii="Microsoft YaHei" w:hAnsi="Microsoft YaHei" w:eastAsia="Microsoft YaHei"/>
-                <w:sz w:val="16"/>
-              </w:rPr>
-              <w:t>对接国际高标准经贸规则；参与国际标准和相关贸易规则制定；提升规则话语权</w:t>
+              <w:t>提升发展中国家的代表性和发言权，打破规则制定垄断</w:t>
+            </w:r>
+          </w:p>
+        </w:tc>
+        <w:tc>
+          <w:tcPr>
+            <w:tcW w:type="dxa" w:w="3096"/>
+          </w:tcPr>
+          <w:p>
+            <w:pPr>
+              <w:spacing w:after="0"/>
+            </w:pPr>
+            <w:r/>
+            <w:r>
+              <w:rPr>
+                <w:rFonts w:ascii="Microsoft YaHei" w:hAnsi="Microsoft YaHei" w:eastAsia="Microsoft YaHei"/>
+                <w:sz w:val="16"/>
+              </w:rPr>
+              <w:t>1</w:t>
+            </w:r>
+          </w:p>
+        </w:tc>
+        <w:tc>
+          <w:tcPr>
+            <w:tcW w:type="dxa" w:w="3096"/>
+          </w:tcPr>
+          <w:p>
+            <w:pPr>
+              <w:spacing w:after="0"/>
+            </w:pPr>
+            <w:r/>
+            <w:r>
+              <w:rPr>
+                <w:rFonts w:ascii="Microsoft YaHei" w:hAnsi="Microsoft YaHei" w:eastAsia="Microsoft YaHei"/>
+                <w:sz w:val="16"/>
+              </w:rPr>
+              <w:t>提升发展中国家的代表性和发言权 / 打破发达国家规则制定中的垄断主导</w:t>
             </w:r>
           </w:p>
         </w:tc>
@@ -3370,7 +2910,7 @@
                 <w:rFonts w:ascii="Microsoft YaHei" w:hAnsi="Microsoft YaHei" w:eastAsia="Microsoft YaHei"/>
                 <w:sz w:val="16"/>
               </w:rPr>
-              <w:t>遇到贸易、投资、市场、供应链、规则和开放合作，优先从全球化机制写。</w:t>
+              <w:t>本节点只保留自贸区、数字经济规则、标准制定和经贸合作中的规则代表性；若设问主问国际秩序公正合理，应回到政治多极化。 遇到贸易、投资、市场、供应链、规则和开放合作，优先从全球化机制写。</w:t>
             </w:r>
           </w:p>
         </w:tc>
@@ -3390,7 +2930,7 @@
                 <w:rFonts w:ascii="Microsoft YaHei" w:hAnsi="Microsoft YaHei" w:eastAsia="Microsoft YaHei"/>
                 <w:sz w:val="16"/>
               </w:rPr>
-              <w:t>以开放促进产业升级，为未来产业拓展国际空间，提升国际竞争力，筑牢安全基础</w:t>
+              <w:t>我国的未来产业有非常广阔的国际市场，为未来产业“走出去”提供了可能</w:t>
             </w:r>
           </w:p>
         </w:tc>
@@ -3426,7 +2966,7 @@
                 <w:rFonts w:ascii="Microsoft YaHei" w:hAnsi="Microsoft YaHei" w:eastAsia="Microsoft YaHei"/>
                 <w:sz w:val="16"/>
               </w:rPr>
-              <w:t>以开放促进产业升级，为未来产业拓展国际空间，提升国际竞争力，筑牢安全基础</w:t>
+              <w:t>我国的未来产业有非常广阔的国际市场，为未来产业“走出去”提供了可能</w:t>
             </w:r>
           </w:p>
         </w:tc>
@@ -3482,43 +3022,43 @@
                 <w:rFonts w:ascii="Microsoft YaHei" w:hAnsi="Microsoft YaHei" w:eastAsia="Microsoft YaHei"/>
                 <w:sz w:val="16"/>
               </w:rPr>
-              <w:t>开放与安全协同发力；动态平衡；系统协同中推动未来产业高质量发展</w:t>
-            </w:r>
-          </w:p>
-        </w:tc>
-        <w:tc>
-          <w:tcPr>
-            <w:tcW w:type="dxa" w:w="3096"/>
-          </w:tcPr>
-          <w:p>
-            <w:pPr>
-              <w:spacing w:after="0"/>
-            </w:pPr>
-            <w:r/>
-            <w:r>
-              <w:rPr>
-                <w:rFonts w:ascii="Microsoft YaHei" w:hAnsi="Microsoft YaHei" w:eastAsia="Microsoft YaHei"/>
-                <w:sz w:val="16"/>
-              </w:rPr>
-              <w:t>1</w:t>
-            </w:r>
-          </w:p>
-        </w:tc>
-        <w:tc>
-          <w:tcPr>
-            <w:tcW w:type="dxa" w:w="3096"/>
-          </w:tcPr>
-          <w:p>
-            <w:pPr>
-              <w:spacing w:after="0"/>
-            </w:pPr>
-            <w:r/>
-            <w:r>
-              <w:rPr>
-                <w:rFonts w:ascii="Microsoft YaHei" w:hAnsi="Microsoft YaHei" w:eastAsia="Microsoft YaHei"/>
-                <w:sz w:val="16"/>
-              </w:rPr>
-              <w:t>开放与安全协同发力；动态平衡；系统协同中推动未来产业高质量发展</w:t>
+              <w:t>对接国际高标准经贸规则，参与国际标准和相关贸易规则制定，提升规则话语权</w:t>
+            </w:r>
+          </w:p>
+        </w:tc>
+        <w:tc>
+          <w:tcPr>
+            <w:tcW w:type="dxa" w:w="3096"/>
+          </w:tcPr>
+          <w:p>
+            <w:pPr>
+              <w:spacing w:after="0"/>
+            </w:pPr>
+            <w:r/>
+            <w:r>
+              <w:rPr>
+                <w:rFonts w:ascii="Microsoft YaHei" w:hAnsi="Microsoft YaHei" w:eastAsia="Microsoft YaHei"/>
+                <w:sz w:val="16"/>
+              </w:rPr>
+              <w:t>3</w:t>
+            </w:r>
+          </w:p>
+        </w:tc>
+        <w:tc>
+          <w:tcPr>
+            <w:tcW w:type="dxa" w:w="3096"/>
+          </w:tcPr>
+          <w:p>
+            <w:pPr>
+              <w:spacing w:after="0"/>
+            </w:pPr>
+            <w:r/>
+            <w:r>
+              <w:rPr>
+                <w:rFonts w:ascii="Microsoft YaHei" w:hAnsi="Microsoft YaHei" w:eastAsia="Microsoft YaHei"/>
+                <w:sz w:val="16"/>
+              </w:rPr>
+              <w:t>对接国际高标准经贸规则；参与国际标准和相关贸易规则制定；提升规则话语权</w:t>
             </w:r>
           </w:p>
         </w:tc>
@@ -3574,7 +3114,7 @@
                 <w:rFonts w:ascii="Microsoft YaHei" w:hAnsi="Microsoft YaHei" w:eastAsia="Microsoft YaHei"/>
                 <w:sz w:val="16"/>
               </w:rPr>
-              <w:t>优惠政策吸引高新技术企业入驻；降低企业税费成本；助力企业科技创新</w:t>
+              <w:t>以开放促进产业升级，为未来产业拓展国际空间，提升国际竞争力，筑牢安全基础</w:t>
             </w:r>
           </w:p>
         </w:tc>
@@ -3610,7 +3150,7 @@
                 <w:rFonts w:ascii="Microsoft YaHei" w:hAnsi="Microsoft YaHei" w:eastAsia="Microsoft YaHei"/>
                 <w:sz w:val="16"/>
               </w:rPr>
-              <w:t>优惠政策吸引高新技术企业入驻；降低企业税费成本；助力企业科技创新</w:t>
+              <w:t>以开放促进产业升级，为未来产业拓展国际空间，提升国际竞争力，筑牢安全基础</w:t>
             </w:r>
           </w:p>
         </w:tc>
@@ -3782,7 +3322,7 @@
                 <w:rFonts w:ascii="Microsoft YaHei" w:hAnsi="Microsoft YaHei" w:eastAsia="Microsoft YaHei"/>
                 <w:sz w:val="16"/>
               </w:rPr>
-              <w:t>依托我国超大规模市场优势，为世界各国提供更加广阔的市场，促进国际合作，实现互利共赢</w:t>
+              <w:t>开放与安全协同发力；动态平衡；系统协同中推动未来产业高质量发展</w:t>
             </w:r>
           </w:p>
         </w:tc>
@@ -3818,7 +3358,7 @@
                 <w:rFonts w:ascii="Microsoft YaHei" w:hAnsi="Microsoft YaHei" w:eastAsia="Microsoft YaHei"/>
                 <w:sz w:val="16"/>
               </w:rPr>
-              <w:t>依托我国超大规模市场优势，为世界各国提供更加广阔的市场，促进国际合作，实现互利共赢</w:t>
+              <w:t>开放与安全协同发力；动态平衡；系统协同中推动未来产业高质量发展</w:t>
             </w:r>
           </w:p>
         </w:tc>
@@ -3874,7 +3414,7 @@
                 <w:rFonts w:ascii="Microsoft YaHei" w:hAnsi="Microsoft YaHei" w:eastAsia="Microsoft YaHei"/>
                 <w:sz w:val="16"/>
               </w:rPr>
-              <w:t>充分运用国际规则，利用国际组织赋予的权利，对话磋商，积极维护自身权益</w:t>
+              <w:t>优惠政策吸引高新技术企业入驻；降低企业税费成本；助力企业科技创新</w:t>
             </w:r>
           </w:p>
         </w:tc>
@@ -3910,7 +3450,7 @@
                 <w:rFonts w:ascii="Microsoft YaHei" w:hAnsi="Microsoft YaHei" w:eastAsia="Microsoft YaHei"/>
                 <w:sz w:val="16"/>
               </w:rPr>
-              <w:t>充分运用国际规则，利用国际组织赋予的权利，对话磋商，积极维护自身权益</w:t>
+              <w:t>优惠政策吸引高新技术企业入驻；降低企业税费成本；助力企业科技创新</w:t>
             </w:r>
           </w:p>
         </w:tc>
@@ -3966,7 +3506,7 @@
                 <w:rFonts w:ascii="Microsoft YaHei" w:hAnsi="Microsoft YaHei" w:eastAsia="Microsoft YaHei"/>
                 <w:sz w:val="16"/>
               </w:rPr>
-              <w:t>加强技术创新、提高产品质量，增强竞争力</w:t>
+              <w:t>依托我国超大规模市场优势，为世界各国提供更加广阔的市场，促进国际合作，实现互利共赢</w:t>
             </w:r>
           </w:p>
         </w:tc>
@@ -4002,7 +3542,7 @@
                 <w:rFonts w:ascii="Microsoft YaHei" w:hAnsi="Microsoft YaHei" w:eastAsia="Microsoft YaHei"/>
                 <w:sz w:val="16"/>
               </w:rPr>
-              <w:t>加强技术创新、提高产品质量，增强竞争力</w:t>
+              <w:t>依托我国超大规模市场优势，为世界各国提供更加广阔的市场，促进国际合作，实现互利共赢</w:t>
             </w:r>
           </w:p>
         </w:tc>
@@ -4058,7 +3598,7 @@
                 <w:rFonts w:ascii="Microsoft YaHei" w:hAnsi="Microsoft YaHei" w:eastAsia="Microsoft YaHei"/>
                 <w:sz w:val="16"/>
               </w:rPr>
-              <w:t>实施出口市场多元化战略，减少对单一市场的依赖</w:t>
+              <w:t>充分运用国际规则，利用国际组织赋予的权利，对话磋商，积极维护自身权益</w:t>
             </w:r>
           </w:p>
         </w:tc>
@@ -4094,7 +3634,7 @@
                 <w:rFonts w:ascii="Microsoft YaHei" w:hAnsi="Microsoft YaHei" w:eastAsia="Microsoft YaHei"/>
                 <w:sz w:val="16"/>
               </w:rPr>
-              <w:t>实施出口市场多元化战略，减少对单一市场的依赖</w:t>
+              <w:t>充分运用国际规则，利用国际组织赋予的权利，对话磋商，积极维护自身权益</w:t>
             </w:r>
           </w:p>
         </w:tc>
@@ -4150,7 +3690,7 @@
                 <w:rFonts w:ascii="Microsoft YaHei" w:hAnsi="Microsoft YaHei" w:eastAsia="Microsoft YaHei"/>
                 <w:sz w:val="16"/>
               </w:rPr>
-              <w:t>深度参与全球产业分工和合作；构建以国内大循环为主体、国内国际双循环相互促进的新发展格局</w:t>
+              <w:t>加强技术创新、提高产品质量，增强竞争力</w:t>
             </w:r>
           </w:p>
         </w:tc>
@@ -4186,7 +3726,7 @@
                 <w:rFonts w:ascii="Microsoft YaHei" w:hAnsi="Microsoft YaHei" w:eastAsia="Microsoft YaHei"/>
                 <w:sz w:val="16"/>
               </w:rPr>
-              <w:t>深度参与全球产业分工和合作；构建以国内大循环为主体、国内国际双循环相互促进的新发展格局</w:t>
+              <w:t>加强技术创新、提高产品质量，增强竞争力</w:t>
             </w:r>
           </w:p>
         </w:tc>
@@ -4242,7 +3782,7 @@
                 <w:rFonts w:ascii="Microsoft YaHei" w:hAnsi="Microsoft YaHei" w:eastAsia="Microsoft YaHei"/>
                 <w:sz w:val="16"/>
               </w:rPr>
-              <w:t>以科学技术的发展推动建设创新型、开放型世界经济</w:t>
+              <w:t>实施出口市场多元化战略，减少对单一市场的依赖</w:t>
             </w:r>
           </w:p>
         </w:tc>
@@ -4278,7 +3818,7 @@
                 <w:rFonts w:ascii="Microsoft YaHei" w:hAnsi="Microsoft YaHei" w:eastAsia="Microsoft YaHei"/>
                 <w:sz w:val="16"/>
               </w:rPr>
-              <w:t>以科学技术的发展推动建设创新型、开放型世界经济（不可替代）；促进经济全球化发展</w:t>
+              <w:t>实施出口市场多元化战略，减少对单一市场的依赖</w:t>
             </w:r>
           </w:p>
         </w:tc>
@@ -4334,7 +3874,7 @@
                 <w:rFonts w:ascii="Microsoft YaHei" w:hAnsi="Microsoft YaHei" w:eastAsia="Microsoft YaHei"/>
                 <w:sz w:val="16"/>
               </w:rPr>
-              <w:t>合作共赢；实现合作共赢；推动各国合作共赢</w:t>
+              <w:t>深度参与全球产业分工和合作；构建以国内大循环为主体、国内国际双循环相互促进的新发展格局</w:t>
             </w:r>
           </w:p>
         </w:tc>
@@ -4370,7 +3910,7 @@
                 <w:rFonts w:ascii="Microsoft YaHei" w:hAnsi="Microsoft YaHei" w:eastAsia="Microsoft YaHei"/>
                 <w:sz w:val="16"/>
               </w:rPr>
-              <w:t>合作共赢；实现合作共赢；推动各国合作共赢</w:t>
+              <w:t>深度参与全球产业分工和合作；构建以国内大循环为主体、国内国际双循环相互促进的新发展格局</w:t>
             </w:r>
           </w:p>
         </w:tc>
@@ -4426,7 +3966,7 @@
                 <w:rFonts w:ascii="Microsoft YaHei" w:hAnsi="Microsoft YaHei" w:eastAsia="Microsoft YaHei"/>
                 <w:sz w:val="16"/>
               </w:rPr>
-              <w:t>通过技术交流与资源共享，带动当地经济、社会发展</w:t>
+              <w:t>以科学技术的发展推动建设创新型、开放型世界经济</w:t>
             </w:r>
           </w:p>
         </w:tc>
@@ -4462,7 +4002,7 @@
                 <w:rFonts w:ascii="Microsoft YaHei" w:hAnsi="Microsoft YaHei" w:eastAsia="Microsoft YaHei"/>
                 <w:sz w:val="16"/>
               </w:rPr>
-              <w:t>通过技术交流与资源共享，带动当地经济、社会发展</w:t>
+              <w:t>以科学技术的发展推动建设创新型、开放型世界经济（不可替代）；促进经济全球化发展</w:t>
             </w:r>
           </w:p>
         </w:tc>
@@ -4518,7 +4058,7 @@
                 <w:rFonts w:ascii="Microsoft YaHei" w:hAnsi="Microsoft YaHei" w:eastAsia="Microsoft YaHei"/>
                 <w:sz w:val="16"/>
               </w:rPr>
-              <w:t>中国市场红利与全球经济包容性增长</w:t>
+              <w:t>合作共赢；实现合作共赢；推动各国合作共赢</w:t>
             </w:r>
           </w:p>
         </w:tc>
@@ -4554,7 +4094,7 @@
                 <w:rFonts w:ascii="Microsoft YaHei" w:hAnsi="Microsoft YaHei" w:eastAsia="Microsoft YaHei"/>
                 <w:sz w:val="16"/>
               </w:rPr>
-              <w:t>推动全球经济包容性增长；为世界提供广大而充满创新活力的市场；向世界释放超大规模市场红利</w:t>
+              <w:t>合作共赢；实现合作共赢；推动各国合作共赢</w:t>
             </w:r>
           </w:p>
         </w:tc>
@@ -4610,7 +4150,7 @@
                 <w:rFonts w:ascii="Microsoft YaHei" w:hAnsi="Microsoft YaHei" w:eastAsia="Microsoft YaHei"/>
                 <w:sz w:val="16"/>
               </w:rPr>
-              <w:t>维护以世界贸易组织为核心的多边贸易体制</w:t>
+              <w:t>通过技术交流与资源共享，带动当地经济、社会发展</w:t>
             </w:r>
           </w:p>
         </w:tc>
@@ -4646,7 +4186,7 @@
                 <w:rFonts w:ascii="Microsoft YaHei" w:hAnsi="Microsoft YaHei" w:eastAsia="Microsoft YaHei"/>
                 <w:sz w:val="16"/>
               </w:rPr>
-              <w:t>坚持世贸组织基本原则，破除贸易壁垒；维护多边贸易体制</w:t>
+              <w:t>通过技术交流与资源共享，带动当地经济、社会发展</w:t>
             </w:r>
           </w:p>
         </w:tc>
@@ -4818,43 +4358,43 @@
                 <w:rFonts w:ascii="Microsoft YaHei" w:hAnsi="Microsoft YaHei" w:eastAsia="Microsoft YaHei"/>
                 <w:sz w:val="16"/>
               </w:rPr>
-              <w:t>推进普惠包容的经济全球化，推动构建更加开放、包容的全球经济格局</w:t>
-            </w:r>
-          </w:p>
-        </w:tc>
-        <w:tc>
-          <w:tcPr>
-            <w:tcW w:type="dxa" w:w="3096"/>
-          </w:tcPr>
-          <w:p>
-            <w:pPr>
-              <w:spacing w:after="0"/>
-            </w:pPr>
-            <w:r/>
-            <w:r>
-              <w:rPr>
-                <w:rFonts w:ascii="Microsoft YaHei" w:hAnsi="Microsoft YaHei" w:eastAsia="Microsoft YaHei"/>
-                <w:sz w:val="16"/>
-              </w:rPr>
-              <w:t>2</w:t>
-            </w:r>
-          </w:p>
-        </w:tc>
-        <w:tc>
-          <w:tcPr>
-            <w:tcW w:type="dxa" w:w="3096"/>
-          </w:tcPr>
-          <w:p>
-            <w:pPr>
-              <w:spacing w:after="0"/>
-            </w:pPr>
-            <w:r/>
-            <w:r>
-              <w:rPr>
-                <w:rFonts w:ascii="Microsoft YaHei" w:hAnsi="Microsoft YaHei" w:eastAsia="Microsoft YaHei"/>
-                <w:sz w:val="16"/>
-              </w:rPr>
-              <w:t>经济全球化方向：普惠、平衡、共赢；更加包容、更可持续</w:t>
+              <w:t>中国市场红利与全球经济包容性增长</w:t>
+            </w:r>
+          </w:p>
+        </w:tc>
+        <w:tc>
+          <w:tcPr>
+            <w:tcW w:type="dxa" w:w="3096"/>
+          </w:tcPr>
+          <w:p>
+            <w:pPr>
+              <w:spacing w:after="0"/>
+            </w:pPr>
+            <w:r/>
+            <w:r>
+              <w:rPr>
+                <w:rFonts w:ascii="Microsoft YaHei" w:hAnsi="Microsoft YaHei" w:eastAsia="Microsoft YaHei"/>
+                <w:sz w:val="16"/>
+              </w:rPr>
+              <w:t>1</w:t>
+            </w:r>
+          </w:p>
+        </w:tc>
+        <w:tc>
+          <w:tcPr>
+            <w:tcW w:type="dxa" w:w="3096"/>
+          </w:tcPr>
+          <w:p>
+            <w:pPr>
+              <w:spacing w:after="0"/>
+            </w:pPr>
+            <w:r/>
+            <w:r>
+              <w:rPr>
+                <w:rFonts w:ascii="Microsoft YaHei" w:hAnsi="Microsoft YaHei" w:eastAsia="Microsoft YaHei"/>
+                <w:sz w:val="16"/>
+              </w:rPr>
+              <w:t>推动全球经济包容性增长；为世界提供广大而充满创新活力的市场；向世界释放超大规模市场红利</w:t>
             </w:r>
           </w:p>
         </w:tc>
@@ -4910,7 +4450,7 @@
                 <w:rFonts w:ascii="Microsoft YaHei" w:hAnsi="Microsoft YaHei" w:eastAsia="Microsoft YaHei"/>
                 <w:sz w:val="16"/>
               </w:rPr>
-              <w:t>以科技助力发展中国家发展；提升其自主发展能力；促进民生改善</w:t>
+              <w:t>维护以世界贸易组织为核心的多边贸易体制</w:t>
             </w:r>
           </w:p>
         </w:tc>
@@ -4946,7 +4486,7 @@
                 <w:rFonts w:ascii="Microsoft YaHei" w:hAnsi="Microsoft YaHei" w:eastAsia="Microsoft YaHei"/>
                 <w:sz w:val="16"/>
               </w:rPr>
-              <w:t>以科技助力发展中国家发展；提升其自主发展能力；促进民生改善</w:t>
+              <w:t>坚持世贸组织基本原则，破除贸易壁垒；维护多边贸易体制</w:t>
             </w:r>
           </w:p>
         </w:tc>
@@ -5002,43 +4542,43 @@
                 <w:rFonts w:ascii="Microsoft YaHei" w:hAnsi="Microsoft YaHei" w:eastAsia="Microsoft YaHei"/>
                 <w:sz w:val="16"/>
               </w:rPr>
-              <w:t>促进资源优化配置；促进国际贸易；为世界新能源产业注入活力；让经济全球化更有活力</w:t>
-            </w:r>
-          </w:p>
-        </w:tc>
-        <w:tc>
-          <w:tcPr>
-            <w:tcW w:type="dxa" w:w="3096"/>
-          </w:tcPr>
-          <w:p>
-            <w:pPr>
-              <w:spacing w:after="0"/>
-            </w:pPr>
-            <w:r/>
-            <w:r>
-              <w:rPr>
-                <w:rFonts w:ascii="Microsoft YaHei" w:hAnsi="Microsoft YaHei" w:eastAsia="Microsoft YaHei"/>
-                <w:sz w:val="16"/>
-              </w:rPr>
-              <w:t>1</w:t>
-            </w:r>
-          </w:p>
-        </w:tc>
-        <w:tc>
-          <w:tcPr>
-            <w:tcW w:type="dxa" w:w="3096"/>
-          </w:tcPr>
-          <w:p>
-            <w:pPr>
-              <w:spacing w:after="0"/>
-            </w:pPr>
-            <w:r/>
-            <w:r>
-              <w:rPr>
-                <w:rFonts w:ascii="Microsoft YaHei" w:hAnsi="Microsoft YaHei" w:eastAsia="Microsoft YaHei"/>
-                <w:sz w:val="16"/>
-              </w:rPr>
-              <w:t>促进资源优化配置；促进国际贸易；为世界新能源产业注入活力；让经济全球化更有活力</w:t>
+              <w:t>推进普惠包容的经济全球化，推动构建更加开放、包容的全球经济格局</w:t>
+            </w:r>
+          </w:p>
+        </w:tc>
+        <w:tc>
+          <w:tcPr>
+            <w:tcW w:type="dxa" w:w="3096"/>
+          </w:tcPr>
+          <w:p>
+            <w:pPr>
+              <w:spacing w:after="0"/>
+            </w:pPr>
+            <w:r/>
+            <w:r>
+              <w:rPr>
+                <w:rFonts w:ascii="Microsoft YaHei" w:hAnsi="Microsoft YaHei" w:eastAsia="Microsoft YaHei"/>
+                <w:sz w:val="16"/>
+              </w:rPr>
+              <w:t>2</w:t>
+            </w:r>
+          </w:p>
+        </w:tc>
+        <w:tc>
+          <w:tcPr>
+            <w:tcW w:type="dxa" w:w="3096"/>
+          </w:tcPr>
+          <w:p>
+            <w:pPr>
+              <w:spacing w:after="0"/>
+            </w:pPr>
+            <w:r/>
+            <w:r>
+              <w:rPr>
+                <w:rFonts w:ascii="Microsoft YaHei" w:hAnsi="Microsoft YaHei" w:eastAsia="Microsoft YaHei"/>
+                <w:sz w:val="16"/>
+              </w:rPr>
+              <w:t>经济全球化方向：普惠、平衡、共赢；更加包容、更可持续</w:t>
             </w:r>
           </w:p>
         </w:tc>
@@ -5094,7 +4634,7 @@
                 <w:rFonts w:ascii="Microsoft YaHei" w:hAnsi="Microsoft YaHei" w:eastAsia="Microsoft YaHei"/>
                 <w:sz w:val="16"/>
               </w:rPr>
-              <w:t>我国用行动为世界气候/环境/绿色/生态保护做贡献</w:t>
+              <w:t>促进资源优化配置；促进国际贸易；为世界新能源产业注入活力；让经济全球化更有活力</w:t>
             </w:r>
           </w:p>
         </w:tc>
@@ -5130,7 +4670,7 @@
                 <w:rFonts w:ascii="Microsoft YaHei" w:hAnsi="Microsoft YaHei" w:eastAsia="Microsoft YaHei"/>
                 <w:sz w:val="16"/>
               </w:rPr>
-              <w:t>我国用行动为世界气候/环境/绿色/生态保护做贡献</w:t>
+              <w:t>促进资源优化配置；促进国际贸易；为世界新能源产业注入活力；让经济全球化更有活力</w:t>
             </w:r>
           </w:p>
         </w:tc>
@@ -5554,7 +5094,7 @@
                 <w:rFonts w:ascii="Microsoft YaHei" w:hAnsi="Microsoft YaHei" w:eastAsia="Microsoft YaHei"/>
                 <w:sz w:val="16"/>
               </w:rPr>
-              <w:t>全球发展倡议通过合作援助，为世界共谋发展合作开辟新空间、提供新机遇、注入新动力，增长发展中国家的发展内生动力，繁荣世界经济</w:t>
+              <w:t>互利共赢的开放战略</w:t>
             </w:r>
           </w:p>
         </w:tc>
@@ -5590,7 +5130,7 @@
                 <w:rFonts w:ascii="Microsoft YaHei" w:hAnsi="Microsoft YaHei" w:eastAsia="Microsoft YaHei"/>
                 <w:sz w:val="16"/>
               </w:rPr>
-              <w:t>全球发展倡议通过合作援助，为世界共谋发展合作开辟新空间、提供新机遇、注入新动力，增长发展中国家的发展内生动力，繁荣世界经济</w:t>
+              <w:t>互利共赢的开放战略</w:t>
             </w:r>
           </w:p>
         </w:tc>
@@ -5627,214 +5167,6 @@
                 <w:sz w:val="16"/>
               </w:rPr>
               <w:t>遇到贸易、投资、市场、供应链、规则和开放合作，优先从全球化机制写。</w:t>
-            </w:r>
-          </w:p>
-        </w:tc>
-      </w:tr>
-      <w:tr>
-        <w:tc>
-          <w:tcPr>
-            <w:tcW w:type="dxa" w:w="3096"/>
-          </w:tcPr>
-          <w:p>
-            <w:pPr>
-              <w:spacing w:after="0"/>
-            </w:pPr>
-            <w:r/>
-            <w:r>
-              <w:rPr>
-                <w:rFonts w:ascii="Microsoft YaHei" w:hAnsi="Microsoft YaHei" w:eastAsia="Microsoft YaHei"/>
-                <w:sz w:val="16"/>
-              </w:rPr>
-              <w:t>互利共赢的开放战略</w:t>
-            </w:r>
-          </w:p>
-        </w:tc>
-        <w:tc>
-          <w:tcPr>
-            <w:tcW w:type="dxa" w:w="3096"/>
-          </w:tcPr>
-          <w:p>
-            <w:pPr>
-              <w:spacing w:after="0"/>
-            </w:pPr>
-            <w:r/>
-            <w:r>
-              <w:rPr>
-                <w:rFonts w:ascii="Microsoft YaHei" w:hAnsi="Microsoft YaHei" w:eastAsia="Microsoft YaHei"/>
-                <w:sz w:val="16"/>
-              </w:rPr>
-              <w:t>1</w:t>
-            </w:r>
-          </w:p>
-        </w:tc>
-        <w:tc>
-          <w:tcPr>
-            <w:tcW w:type="dxa" w:w="3096"/>
-          </w:tcPr>
-          <w:p>
-            <w:pPr>
-              <w:spacing w:after="0"/>
-            </w:pPr>
-            <w:r/>
-            <w:r>
-              <w:rPr>
-                <w:rFonts w:ascii="Microsoft YaHei" w:hAnsi="Microsoft YaHei" w:eastAsia="Microsoft YaHei"/>
-                <w:sz w:val="16"/>
-              </w:rPr>
-              <w:t>互利共赢的开放战略</w:t>
-            </w:r>
-          </w:p>
-        </w:tc>
-        <w:tc>
-          <w:tcPr>
-            <w:tcW w:type="dxa" w:w="3096"/>
-          </w:tcPr>
-          <w:p>
-            <w:pPr>
-              <w:spacing w:after="0"/>
-            </w:pPr>
-            <w:r/>
-            <w:r>
-              <w:rPr>
-                <w:rFonts w:ascii="Microsoft YaHei" w:hAnsi="Microsoft YaHei" w:eastAsia="Microsoft YaHei"/>
-                <w:sz w:val="16"/>
-              </w:rPr>
-              <w:t>同名二级标题</w:t>
-            </w:r>
-          </w:p>
-        </w:tc>
-        <w:tc>
-          <w:tcPr>
-            <w:tcW w:type="dxa" w:w="3096"/>
-          </w:tcPr>
-          <w:p>
-            <w:pPr>
-              <w:spacing w:after="0"/>
-            </w:pPr>
-            <w:r/>
-            <w:r>
-              <w:rPr>
-                <w:rFonts w:ascii="Microsoft YaHei" w:hAnsi="Microsoft YaHei" w:eastAsia="Microsoft YaHei"/>
-                <w:sz w:val="16"/>
-              </w:rPr>
-              <w:t>遇到贸易、投资、市场、供应链、规则和开放合作，优先从全球化机制写。</w:t>
-            </w:r>
-          </w:p>
-        </w:tc>
-      </w:tr>
-    </w:tbl>
-    <w:tbl>
-      <w:tblPr>
-        <w:tblStyle w:val="TableGrid"/>
-        <w:tblW w:type="auto" w:w="0"/>
-        <w:tblLook w:firstColumn="1" w:firstRow="1" w:lastColumn="0" w:lastRow="0" w:noHBand="0" w:noVBand="1" w:val="04A0"/>
-      </w:tblPr>
-      <w:tblGrid>
-        <w:gridCol w:w="3096"/>
-        <w:gridCol w:w="3096"/>
-        <w:gridCol w:w="3096"/>
-        <w:gridCol w:w="3096"/>
-        <w:gridCol w:w="3096"/>
-      </w:tblGrid>
-      <w:tr>
-        <w:tc>
-          <w:tcPr>
-            <w:tcW w:type="dxa" w:w="3096"/>
-            <w:shd w:fill="D9EAF7"/>
-          </w:tcPr>
-          <w:p>
-            <w:pPr>
-              <w:spacing w:after="0"/>
-            </w:pPr>
-            <w:r/>
-            <w:r>
-              <w:rPr>
-                <w:rFonts w:ascii="Microsoft YaHei" w:hAnsi="Microsoft YaHei" w:eastAsia="Microsoft YaHei"/>
-                <w:b/>
-                <w:sz w:val="16"/>
-              </w:rPr>
-              <w:t>核心答题点</w:t>
-            </w:r>
-          </w:p>
-        </w:tc>
-        <w:tc>
-          <w:tcPr>
-            <w:tcW w:type="dxa" w:w="3096"/>
-            <w:shd w:fill="D9EAF7"/>
-          </w:tcPr>
-          <w:p>
-            <w:pPr>
-              <w:spacing w:after="0"/>
-            </w:pPr>
-            <w:r/>
-            <w:r>
-              <w:rPr>
-                <w:rFonts w:ascii="Microsoft YaHei" w:hAnsi="Microsoft YaHei" w:eastAsia="Microsoft YaHei"/>
-                <w:b/>
-                <w:sz w:val="16"/>
-              </w:rPr>
-              <w:t>出现</w:t>
-            </w:r>
-          </w:p>
-        </w:tc>
-        <w:tc>
-          <w:tcPr>
-            <w:tcW w:type="dxa" w:w="3096"/>
-            <w:shd w:fill="D9EAF7"/>
-          </w:tcPr>
-          <w:p>
-            <w:pPr>
-              <w:spacing w:after="0"/>
-            </w:pPr>
-            <w:r/>
-            <w:r>
-              <w:rPr>
-                <w:rFonts w:ascii="Microsoft YaHei" w:hAnsi="Microsoft YaHei" w:eastAsia="Microsoft YaHei"/>
-                <w:b/>
-                <w:sz w:val="16"/>
-              </w:rPr>
-              <w:t>表述积累首句</w:t>
-            </w:r>
-          </w:p>
-        </w:tc>
-        <w:tc>
-          <w:tcPr>
-            <w:tcW w:type="dxa" w:w="3096"/>
-            <w:shd w:fill="D9EAF7"/>
-          </w:tcPr>
-          <w:p>
-            <w:pPr>
-              <w:spacing w:after="0"/>
-            </w:pPr>
-            <w:r/>
-            <w:r>
-              <w:rPr>
-                <w:rFonts w:ascii="Microsoft YaHei" w:hAnsi="Microsoft YaHei" w:eastAsia="Microsoft YaHei"/>
-                <w:b/>
-                <w:sz w:val="16"/>
-              </w:rPr>
-              <w:t>厚版定位</w:t>
-            </w:r>
-          </w:p>
-        </w:tc>
-        <w:tc>
-          <w:tcPr>
-            <w:tcW w:type="dxa" w:w="3096"/>
-            <w:shd w:fill="D9EAF7"/>
-          </w:tcPr>
-          <w:p>
-            <w:pPr>
-              <w:spacing w:after="0"/>
-            </w:pPr>
-            <w:r/>
-            <w:r>
-              <w:rPr>
-                <w:rFonts w:ascii="Microsoft YaHei" w:hAnsi="Microsoft YaHei" w:eastAsia="Microsoft YaHei"/>
-                <w:b/>
-                <w:sz w:val="16"/>
-              </w:rPr>
-              <w:t>迁移提醒</w:t>
             </w:r>
           </w:p>
         </w:tc>
@@ -7553,190 +6885,6 @@
                 <w:sz w:val="16"/>
               </w:rPr>
               <w:t>在平等互利基础上开展合作；互利共赢</w:t>
-            </w:r>
-          </w:p>
-        </w:tc>
-        <w:tc>
-          <w:tcPr>
-            <w:tcW w:type="dxa" w:w="3096"/>
-          </w:tcPr>
-          <w:p>
-            <w:pPr>
-              <w:spacing w:after="0"/>
-            </w:pPr>
-            <w:r/>
-            <w:r>
-              <w:rPr>
-                <w:rFonts w:ascii="Microsoft YaHei" w:hAnsi="Microsoft YaHei" w:eastAsia="Microsoft YaHei"/>
-                <w:sz w:val="16"/>
-              </w:rPr>
-              <w:t>同名二级标题</w:t>
-            </w:r>
-          </w:p>
-        </w:tc>
-        <w:tc>
-          <w:tcPr>
-            <w:tcW w:type="dxa" w:w="3096"/>
-          </w:tcPr>
-          <w:p>
-            <w:pPr>
-              <w:spacing w:after="0"/>
-            </w:pPr>
-            <w:r/>
-            <w:r>
-              <w:rPr>
-                <w:rFonts w:ascii="Microsoft YaHei" w:hAnsi="Microsoft YaHei" w:eastAsia="Microsoft YaHei"/>
-                <w:sz w:val="16"/>
-              </w:rPr>
-              <w:t>遇到秩序、治理、话语权、多边主义，优先从政治多极化和全球治理写。</w:t>
-            </w:r>
-          </w:p>
-        </w:tc>
-      </w:tr>
-      <w:tr>
-        <w:tc>
-          <w:tcPr>
-            <w:tcW w:type="dxa" w:w="3096"/>
-          </w:tcPr>
-          <w:p>
-            <w:pPr>
-              <w:spacing w:after="0"/>
-            </w:pPr>
-            <w:r/>
-            <w:r>
-              <w:rPr>
-                <w:rFonts w:ascii="Microsoft YaHei" w:hAnsi="Microsoft YaHei" w:eastAsia="Microsoft YaHei"/>
-                <w:sz w:val="16"/>
-              </w:rPr>
-              <w:t>全球安全倡议主张在联合国宪章宗旨和原则下，通过对话协商以和平方式解决国际争端，以共赢思维应对安全挑战，推动建设持久和平、普遍安全的世界</w:t>
-            </w:r>
-          </w:p>
-        </w:tc>
-        <w:tc>
-          <w:tcPr>
-            <w:tcW w:type="dxa" w:w="3096"/>
-          </w:tcPr>
-          <w:p>
-            <w:pPr>
-              <w:spacing w:after="0"/>
-            </w:pPr>
-            <w:r/>
-            <w:r>
-              <w:rPr>
-                <w:rFonts w:ascii="Microsoft YaHei" w:hAnsi="Microsoft YaHei" w:eastAsia="Microsoft YaHei"/>
-                <w:sz w:val="16"/>
-              </w:rPr>
-              <w:t>1</w:t>
-            </w:r>
-          </w:p>
-        </w:tc>
-        <w:tc>
-          <w:tcPr>
-            <w:tcW w:type="dxa" w:w="3096"/>
-          </w:tcPr>
-          <w:p>
-            <w:pPr>
-              <w:spacing w:after="0"/>
-            </w:pPr>
-            <w:r/>
-            <w:r>
-              <w:rPr>
-                <w:rFonts w:ascii="Microsoft YaHei" w:hAnsi="Microsoft YaHei" w:eastAsia="Microsoft YaHei"/>
-                <w:sz w:val="16"/>
-              </w:rPr>
-              <w:t>全球安全倡议主张在联合国宪章宗旨和原则下，通过对话协商以和平方式解决国际争端，以共赢思维应对安全挑战，推动建设持久和平、普遍安全的世界</w:t>
-            </w:r>
-          </w:p>
-        </w:tc>
-        <w:tc>
-          <w:tcPr>
-            <w:tcW w:type="dxa" w:w="3096"/>
-          </w:tcPr>
-          <w:p>
-            <w:pPr>
-              <w:spacing w:after="0"/>
-            </w:pPr>
-            <w:r/>
-            <w:r>
-              <w:rPr>
-                <w:rFonts w:ascii="Microsoft YaHei" w:hAnsi="Microsoft YaHei" w:eastAsia="Microsoft YaHei"/>
-                <w:sz w:val="16"/>
-              </w:rPr>
-              <w:t>同名二级标题</w:t>
-            </w:r>
-          </w:p>
-        </w:tc>
-        <w:tc>
-          <w:tcPr>
-            <w:tcW w:type="dxa" w:w="3096"/>
-          </w:tcPr>
-          <w:p>
-            <w:pPr>
-              <w:spacing w:after="0"/>
-            </w:pPr>
-            <w:r/>
-            <w:r>
-              <w:rPr>
-                <w:rFonts w:ascii="Microsoft YaHei" w:hAnsi="Microsoft YaHei" w:eastAsia="Microsoft YaHei"/>
-                <w:sz w:val="16"/>
-              </w:rPr>
-              <w:t>遇到秩序、治理、话语权、多边主义，优先从政治多极化和全球治理写。</w:t>
-            </w:r>
-          </w:p>
-        </w:tc>
-      </w:tr>
-      <w:tr>
-        <w:tc>
-          <w:tcPr>
-            <w:tcW w:type="dxa" w:w="3096"/>
-          </w:tcPr>
-          <w:p>
-            <w:pPr>
-              <w:spacing w:after="0"/>
-            </w:pPr>
-            <w:r/>
-            <w:r>
-              <w:rPr>
-                <w:rFonts w:ascii="Microsoft YaHei" w:hAnsi="Microsoft YaHei" w:eastAsia="Microsoft YaHei"/>
-                <w:sz w:val="16"/>
-              </w:rPr>
-              <w:t>通过交流互鉴、传承和创新，促进民心相通，建设开放包容的世界</w:t>
-            </w:r>
-          </w:p>
-        </w:tc>
-        <w:tc>
-          <w:tcPr>
-            <w:tcW w:type="dxa" w:w="3096"/>
-          </w:tcPr>
-          <w:p>
-            <w:pPr>
-              <w:spacing w:after="0"/>
-            </w:pPr>
-            <w:r/>
-            <w:r>
-              <w:rPr>
-                <w:rFonts w:ascii="Microsoft YaHei" w:hAnsi="Microsoft YaHei" w:eastAsia="Microsoft YaHei"/>
-                <w:sz w:val="16"/>
-              </w:rPr>
-              <w:t>1</w:t>
-            </w:r>
-          </w:p>
-        </w:tc>
-        <w:tc>
-          <w:tcPr>
-            <w:tcW w:type="dxa" w:w="3096"/>
-          </w:tcPr>
-          <w:p>
-            <w:pPr>
-              <w:spacing w:after="0"/>
-            </w:pPr>
-            <w:r/>
-            <w:r>
-              <w:rPr>
-                <w:rFonts w:ascii="Microsoft YaHei" w:hAnsi="Microsoft YaHei" w:eastAsia="Microsoft YaHei"/>
-                <w:sz w:val="16"/>
-              </w:rPr>
-              <w:t>通过交流互鉴、传承和创新，促进民心相通，建设开放包容的世界</w:t>
             </w:r>
           </w:p>
         </w:tc>
@@ -7972,43 +7120,43 @@
                 <w:rFonts w:ascii="Microsoft YaHei" w:hAnsi="Microsoft YaHei" w:eastAsia="Microsoft YaHei"/>
                 <w:sz w:val="16"/>
               </w:rPr>
-              <w:t>贡献中国智慧、中国方案、中国力量</w:t>
-            </w:r>
-          </w:p>
-        </w:tc>
-        <w:tc>
-          <w:tcPr>
-            <w:tcW w:type="dxa" w:w="3096"/>
-          </w:tcPr>
-          <w:p>
-            <w:pPr>
-              <w:spacing w:after="0"/>
-            </w:pPr>
-            <w:r/>
-            <w:r>
-              <w:rPr>
-                <w:rFonts w:ascii="Microsoft YaHei" w:hAnsi="Microsoft YaHei" w:eastAsia="Microsoft YaHei"/>
-                <w:sz w:val="16"/>
-              </w:rPr>
-              <w:t>8</w:t>
-            </w:r>
-          </w:p>
-        </w:tc>
-        <w:tc>
-          <w:tcPr>
-            <w:tcW w:type="dxa" w:w="3096"/>
-          </w:tcPr>
-          <w:p>
-            <w:pPr>
-              <w:spacing w:after="0"/>
-            </w:pPr>
-            <w:r/>
-            <w:r>
-              <w:rPr>
-                <w:rFonts w:ascii="Microsoft YaHei" w:hAnsi="Microsoft YaHei" w:eastAsia="Microsoft YaHei"/>
-                <w:sz w:val="16"/>
-              </w:rPr>
-              <w:t>贡献中国智慧、中国方案、勇于大国担当</w:t>
+              <w:t>坚持总体国家安全观，统筹发展与安全，以新安全格局保障新发展格局</w:t>
+            </w:r>
+          </w:p>
+        </w:tc>
+        <w:tc>
+          <w:tcPr>
+            <w:tcW w:type="dxa" w:w="3096"/>
+          </w:tcPr>
+          <w:p>
+            <w:pPr>
+              <w:spacing w:after="0"/>
+            </w:pPr>
+            <w:r/>
+            <w:r>
+              <w:rPr>
+                <w:rFonts w:ascii="Microsoft YaHei" w:hAnsi="Microsoft YaHei" w:eastAsia="Microsoft YaHei"/>
+                <w:sz w:val="16"/>
+              </w:rPr>
+              <w:t>2</w:t>
+            </w:r>
+          </w:p>
+        </w:tc>
+        <w:tc>
+          <w:tcPr>
+            <w:tcW w:type="dxa" w:w="3096"/>
+          </w:tcPr>
+          <w:p>
+            <w:pPr>
+              <w:spacing w:after="0"/>
+            </w:pPr>
+            <w:r/>
+            <w:r>
+              <w:rPr>
+                <w:rFonts w:ascii="Microsoft YaHei" w:hAnsi="Microsoft YaHei" w:eastAsia="Microsoft YaHei"/>
+                <w:sz w:val="16"/>
+              </w:rPr>
+              <w:t>处理好发展和安全的关系 / 统筹发展和安全；总体国家安全观 / 底线思维 / 维护国家经济安全、科技安全 / 应对风险等；经济平稳可持续发展 / 高质量发展 / 注入新动能等</w:t>
             </w:r>
           </w:p>
         </w:tc>
@@ -8064,43 +7212,43 @@
                 <w:rFonts w:ascii="Microsoft YaHei" w:hAnsi="Microsoft YaHei" w:eastAsia="Microsoft YaHei"/>
                 <w:sz w:val="16"/>
               </w:rPr>
-              <w:t>坚持正确义利观</w:t>
-            </w:r>
-          </w:p>
-        </w:tc>
-        <w:tc>
-          <w:tcPr>
-            <w:tcW w:type="dxa" w:w="3096"/>
-          </w:tcPr>
-          <w:p>
-            <w:pPr>
-              <w:spacing w:after="0"/>
-            </w:pPr>
-            <w:r/>
-            <w:r>
-              <w:rPr>
-                <w:rFonts w:ascii="Microsoft YaHei" w:hAnsi="Microsoft YaHei" w:eastAsia="Microsoft YaHei"/>
-                <w:sz w:val="16"/>
-              </w:rPr>
-              <w:t>5</w:t>
-            </w:r>
-          </w:p>
-        </w:tc>
-        <w:tc>
-          <w:tcPr>
-            <w:tcW w:type="dxa" w:w="3096"/>
-          </w:tcPr>
-          <w:p>
-            <w:pPr>
-              <w:spacing w:after="0"/>
-            </w:pPr>
-            <w:r/>
-            <w:r>
-              <w:rPr>
-                <w:rFonts w:ascii="Microsoft YaHei" w:hAnsi="Microsoft YaHei" w:eastAsia="Microsoft YaHei"/>
-                <w:sz w:val="16"/>
-              </w:rPr>
-              <w:t>处理好中国发展和世界发展的关系；维护本国利益、谋求本国发展；兼顾他国合理关切、为世界提供公共产品和机遇、正确义利观、推动发展中国家、贡献中国智慧和中国方案、大国责任、推动构建人类命运共同体</w:t>
+              <w:t>贡献中国智慧、中国方案、中国力量</w:t>
+            </w:r>
+          </w:p>
+        </w:tc>
+        <w:tc>
+          <w:tcPr>
+            <w:tcW w:type="dxa" w:w="3096"/>
+          </w:tcPr>
+          <w:p>
+            <w:pPr>
+              <w:spacing w:after="0"/>
+            </w:pPr>
+            <w:r/>
+            <w:r>
+              <w:rPr>
+                <w:rFonts w:ascii="Microsoft YaHei" w:hAnsi="Microsoft YaHei" w:eastAsia="Microsoft YaHei"/>
+                <w:sz w:val="16"/>
+              </w:rPr>
+              <w:t>8</w:t>
+            </w:r>
+          </w:p>
+        </w:tc>
+        <w:tc>
+          <w:tcPr>
+            <w:tcW w:type="dxa" w:w="3096"/>
+          </w:tcPr>
+          <w:p>
+            <w:pPr>
+              <w:spacing w:after="0"/>
+            </w:pPr>
+            <w:r/>
+            <w:r>
+              <w:rPr>
+                <w:rFonts w:ascii="Microsoft YaHei" w:hAnsi="Microsoft YaHei" w:eastAsia="Microsoft YaHei"/>
+                <w:sz w:val="16"/>
+              </w:rPr>
+              <w:t>贡献中国智慧、中国方案、勇于大国担当</w:t>
             </w:r>
           </w:p>
         </w:tc>
@@ -8156,7 +7304,7 @@
                 <w:rFonts w:ascii="Microsoft YaHei" w:hAnsi="Microsoft YaHei" w:eastAsia="Microsoft YaHei"/>
                 <w:sz w:val="16"/>
               </w:rPr>
-              <w:t>中国综合国力、国际地位和话语权提升</w:t>
+              <w:t>坚持正确义利观</w:t>
             </w:r>
           </w:p>
         </w:tc>
@@ -8192,7 +7340,7 @@
                 <w:rFonts w:ascii="Microsoft YaHei" w:hAnsi="Microsoft YaHei" w:eastAsia="Microsoft YaHei"/>
                 <w:sz w:val="16"/>
               </w:rPr>
-              <w:t>中国的综合国力不断增强，国际地位不断提升，承担越来越多的国际责任</w:t>
+              <w:t>处理好中国发展和世界发展的关系；维护本国利益、谋求本国发展；兼顾他国合理关切、为世界提供公共产品和机遇、正确义利观、推动发展中国家、贡献中国智慧和中国方案、大国责任、推动构建人类命运共同体</w:t>
             </w:r>
           </w:p>
         </w:tc>
@@ -8248,43 +7396,43 @@
                 <w:rFonts w:ascii="Microsoft YaHei" w:hAnsi="Microsoft YaHei" w:eastAsia="Microsoft YaHei"/>
                 <w:sz w:val="16"/>
               </w:rPr>
-              <w:t>习近平外交思想指导中国特色大国外交（外交为民、服务中国式现代化）</w:t>
-            </w:r>
-          </w:p>
-        </w:tc>
-        <w:tc>
-          <w:tcPr>
-            <w:tcW w:type="dxa" w:w="3096"/>
-          </w:tcPr>
-          <w:p>
-            <w:pPr>
-              <w:spacing w:after="0"/>
-            </w:pPr>
-            <w:r/>
-            <w:r>
-              <w:rPr>
-                <w:rFonts w:ascii="Microsoft YaHei" w:hAnsi="Microsoft YaHei" w:eastAsia="Microsoft YaHei"/>
-                <w:sz w:val="16"/>
-              </w:rPr>
-              <w:t>3</w:t>
-            </w:r>
-          </w:p>
-        </w:tc>
-        <w:tc>
-          <w:tcPr>
-            <w:tcW w:type="dxa" w:w="3096"/>
-          </w:tcPr>
-          <w:p>
-            <w:pPr>
-              <w:spacing w:after="0"/>
-            </w:pPr>
-            <w:r/>
-            <w:r>
-              <w:rPr>
-                <w:rFonts w:ascii="Microsoft YaHei" w:hAnsi="Microsoft YaHei" w:eastAsia="Microsoft YaHei"/>
-                <w:sz w:val="16"/>
-              </w:rPr>
-              <w:t>外交指导思想与时俱进，习近平外交思想为新时代中国特色大国外交提供了根本遵循和行动指南</w:t>
+              <w:t>中国综合国力、国际地位和话语权提升</w:t>
+            </w:r>
+          </w:p>
+        </w:tc>
+        <w:tc>
+          <w:tcPr>
+            <w:tcW w:type="dxa" w:w="3096"/>
+          </w:tcPr>
+          <w:p>
+            <w:pPr>
+              <w:spacing w:after="0"/>
+            </w:pPr>
+            <w:r/>
+            <w:r>
+              <w:rPr>
+                <w:rFonts w:ascii="Microsoft YaHei" w:hAnsi="Microsoft YaHei" w:eastAsia="Microsoft YaHei"/>
+                <w:sz w:val="16"/>
+              </w:rPr>
+              <w:t>5</w:t>
+            </w:r>
+          </w:p>
+        </w:tc>
+        <w:tc>
+          <w:tcPr>
+            <w:tcW w:type="dxa" w:w="3096"/>
+          </w:tcPr>
+          <w:p>
+            <w:pPr>
+              <w:spacing w:after="0"/>
+            </w:pPr>
+            <w:r/>
+            <w:r>
+              <w:rPr>
+                <w:rFonts w:ascii="Microsoft YaHei" w:hAnsi="Microsoft YaHei" w:eastAsia="Microsoft YaHei"/>
+                <w:sz w:val="16"/>
+              </w:rPr>
+              <w:t>中国的综合国力不断增强，国际地位不断提升，承担越来越多的国际责任</w:t>
             </w:r>
           </w:p>
         </w:tc>
@@ -8340,43 +7488,43 @@
                 <w:rFonts w:ascii="Microsoft YaHei" w:hAnsi="Microsoft YaHei" w:eastAsia="Microsoft YaHei"/>
                 <w:sz w:val="16"/>
               </w:rPr>
-              <w:t>新中国外交始终服务于我国人民民主专政的国家性质</w:t>
-            </w:r>
-          </w:p>
-        </w:tc>
-        <w:tc>
-          <w:tcPr>
-            <w:tcW w:type="dxa" w:w="3096"/>
-          </w:tcPr>
-          <w:p>
-            <w:pPr>
-              <w:spacing w:after="0"/>
-            </w:pPr>
-            <w:r/>
-            <w:r>
-              <w:rPr>
-                <w:rFonts w:ascii="Microsoft YaHei" w:hAnsi="Microsoft YaHei" w:eastAsia="Microsoft YaHei"/>
-                <w:sz w:val="16"/>
-              </w:rPr>
-              <w:t>1</w:t>
-            </w:r>
-          </w:p>
-        </w:tc>
-        <w:tc>
-          <w:tcPr>
-            <w:tcW w:type="dxa" w:w="3096"/>
-          </w:tcPr>
-          <w:p>
-            <w:pPr>
-              <w:spacing w:after="0"/>
-            </w:pPr>
-            <w:r/>
-            <w:r>
-              <w:rPr>
-                <w:rFonts w:ascii="Microsoft YaHei" w:hAnsi="Microsoft YaHei" w:eastAsia="Microsoft YaHei"/>
-                <w:sz w:val="16"/>
-              </w:rPr>
-              <w:t>新中国外交始终服务于我国人民民主专政的国家性质</w:t>
+              <w:t>习近平外交思想指导中国特色大国外交（外交为民、服务中国式现代化）</w:t>
+            </w:r>
+          </w:p>
+        </w:tc>
+        <w:tc>
+          <w:tcPr>
+            <w:tcW w:type="dxa" w:w="3096"/>
+          </w:tcPr>
+          <w:p>
+            <w:pPr>
+              <w:spacing w:after="0"/>
+            </w:pPr>
+            <w:r/>
+            <w:r>
+              <w:rPr>
+                <w:rFonts w:ascii="Microsoft YaHei" w:hAnsi="Microsoft YaHei" w:eastAsia="Microsoft YaHei"/>
+                <w:sz w:val="16"/>
+              </w:rPr>
+              <w:t>3</w:t>
+            </w:r>
+          </w:p>
+        </w:tc>
+        <w:tc>
+          <w:tcPr>
+            <w:tcW w:type="dxa" w:w="3096"/>
+          </w:tcPr>
+          <w:p>
+            <w:pPr>
+              <w:spacing w:after="0"/>
+            </w:pPr>
+            <w:r/>
+            <w:r>
+              <w:rPr>
+                <w:rFonts w:ascii="Microsoft YaHei" w:hAnsi="Microsoft YaHei" w:eastAsia="Microsoft YaHei"/>
+                <w:sz w:val="16"/>
+              </w:rPr>
+              <w:t>外交指导思想与时俱进，习近平外交思想为新时代中国特色大国外交提供了根本遵循和行动指南</w:t>
             </w:r>
           </w:p>
         </w:tc>
@@ -8432,43 +7580,43 @@
                 <w:rFonts w:ascii="Microsoft YaHei" w:hAnsi="Microsoft YaHei" w:eastAsia="Microsoft YaHei"/>
                 <w:sz w:val="16"/>
               </w:rPr>
-              <w:t>中国坚持独立自主和平外交与和平共处五项原则</w:t>
-            </w:r>
-          </w:p>
-        </w:tc>
-        <w:tc>
-          <w:tcPr>
-            <w:tcW w:type="dxa" w:w="3096"/>
-          </w:tcPr>
-          <w:p>
-            <w:pPr>
-              <w:spacing w:after="0"/>
-            </w:pPr>
-            <w:r/>
-            <w:r>
-              <w:rPr>
-                <w:rFonts w:ascii="Microsoft YaHei" w:hAnsi="Microsoft YaHei" w:eastAsia="Microsoft YaHei"/>
-                <w:sz w:val="16"/>
-              </w:rPr>
-              <w:t>6</w:t>
-            </w:r>
-          </w:p>
-        </w:tc>
-        <w:tc>
-          <w:tcPr>
-            <w:tcW w:type="dxa" w:w="3096"/>
-          </w:tcPr>
-          <w:p>
-            <w:pPr>
-              <w:spacing w:after="0"/>
-            </w:pPr>
-            <w:r/>
-            <w:r>
-              <w:rPr>
-                <w:rFonts w:ascii="Microsoft YaHei" w:hAnsi="Microsoft YaHei" w:eastAsia="Microsoft YaHei"/>
-                <w:sz w:val="16"/>
-              </w:rPr>
-              <w:t>独立自主的和平外交政策；坚持独立自主的基本立场；贯彻维护世界和平、促进共同发展的宗旨；促进世界和平与发展为基本目标；坚持以和平共处五项原则作为我国对外关系基本准则</w:t>
+              <w:t>新中国外交始终服务于我国人民民主专政的国家性质；坚持党对外交统一集中领导</w:t>
+            </w:r>
+          </w:p>
+        </w:tc>
+        <w:tc>
+          <w:tcPr>
+            <w:tcW w:type="dxa" w:w="3096"/>
+          </w:tcPr>
+          <w:p>
+            <w:pPr>
+              <w:spacing w:after="0"/>
+            </w:pPr>
+            <w:r/>
+            <w:r>
+              <w:rPr>
+                <w:rFonts w:ascii="Microsoft YaHei" w:hAnsi="Microsoft YaHei" w:eastAsia="Microsoft YaHei"/>
+                <w:sz w:val="16"/>
+              </w:rPr>
+              <w:t>2</w:t>
+            </w:r>
+          </w:p>
+        </w:tc>
+        <w:tc>
+          <w:tcPr>
+            <w:tcW w:type="dxa" w:w="3096"/>
+          </w:tcPr>
+          <w:p>
+            <w:pPr>
+              <w:spacing w:after="0"/>
+            </w:pPr>
+            <w:r/>
+            <w:r>
+              <w:rPr>
+                <w:rFonts w:ascii="Microsoft YaHei" w:hAnsi="Microsoft YaHei" w:eastAsia="Microsoft YaHei"/>
+                <w:sz w:val="16"/>
+              </w:rPr>
+              <w:t>新中国外交始终服务于我国人民民主专政的国家性质</w:t>
             </w:r>
           </w:p>
         </w:tc>
@@ -8524,43 +7672,43 @@
                 <w:rFonts w:ascii="Microsoft YaHei" w:hAnsi="Microsoft YaHei" w:eastAsia="Microsoft YaHei"/>
                 <w:sz w:val="16"/>
               </w:rPr>
-              <w:t>与发展中国家共享发展新机遇，惠民生增福祉，实现互利共赢</w:t>
-            </w:r>
-          </w:p>
-        </w:tc>
-        <w:tc>
-          <w:tcPr>
-            <w:tcW w:type="dxa" w:w="3096"/>
-          </w:tcPr>
-          <w:p>
-            <w:pPr>
-              <w:spacing w:after="0"/>
-            </w:pPr>
-            <w:r/>
-            <w:r>
-              <w:rPr>
-                <w:rFonts w:ascii="Microsoft YaHei" w:hAnsi="Microsoft YaHei" w:eastAsia="Microsoft YaHei"/>
-                <w:sz w:val="16"/>
-              </w:rPr>
-              <w:t>1</w:t>
-            </w:r>
-          </w:p>
-        </w:tc>
-        <w:tc>
-          <w:tcPr>
-            <w:tcW w:type="dxa" w:w="3096"/>
-          </w:tcPr>
-          <w:p>
-            <w:pPr>
-              <w:spacing w:after="0"/>
-            </w:pPr>
-            <w:r/>
-            <w:r>
-              <w:rPr>
-                <w:rFonts w:ascii="Microsoft YaHei" w:hAnsi="Microsoft YaHei" w:eastAsia="Microsoft YaHei"/>
-                <w:sz w:val="16"/>
-              </w:rPr>
-              <w:t>与发展中国家共享发展新机遇，惠民生增福祉，实现互利共赢</w:t>
+              <w:t>中国坚持独立自主和平外交与和平共处五项原则</w:t>
+            </w:r>
+          </w:p>
+        </w:tc>
+        <w:tc>
+          <w:tcPr>
+            <w:tcW w:type="dxa" w:w="3096"/>
+          </w:tcPr>
+          <w:p>
+            <w:pPr>
+              <w:spacing w:after="0"/>
+            </w:pPr>
+            <w:r/>
+            <w:r>
+              <w:rPr>
+                <w:rFonts w:ascii="Microsoft YaHei" w:hAnsi="Microsoft YaHei" w:eastAsia="Microsoft YaHei"/>
+                <w:sz w:val="16"/>
+              </w:rPr>
+              <w:t>6</w:t>
+            </w:r>
+          </w:p>
+        </w:tc>
+        <w:tc>
+          <w:tcPr>
+            <w:tcW w:type="dxa" w:w="3096"/>
+          </w:tcPr>
+          <w:p>
+            <w:pPr>
+              <w:spacing w:after="0"/>
+            </w:pPr>
+            <w:r/>
+            <w:r>
+              <w:rPr>
+                <w:rFonts w:ascii="Microsoft YaHei" w:hAnsi="Microsoft YaHei" w:eastAsia="Microsoft YaHei"/>
+                <w:sz w:val="16"/>
+              </w:rPr>
+              <w:t>独立自主的和平外交政策；坚持独立自主的基本立场；贯彻维护世界和平、促进共同发展的宗旨；促进世界和平与发展为基本目标；坚持以和平共处五项原则作为我国对外关系基本准则</w:t>
             </w:r>
           </w:p>
         </w:tc>
@@ -8616,43 +7764,43 @@
                 <w:rFonts w:ascii="Microsoft YaHei" w:hAnsi="Microsoft YaHei" w:eastAsia="Microsoft YaHei"/>
                 <w:sz w:val="16"/>
               </w:rPr>
-              <w:t>中国推动构建人类命运共同体</w:t>
-            </w:r>
-          </w:p>
-        </w:tc>
-        <w:tc>
-          <w:tcPr>
-            <w:tcW w:type="dxa" w:w="3096"/>
-          </w:tcPr>
-          <w:p>
-            <w:pPr>
-              <w:spacing w:after="0"/>
-            </w:pPr>
-            <w:r/>
-            <w:r>
-              <w:rPr>
-                <w:rFonts w:ascii="Microsoft YaHei" w:hAnsi="Microsoft YaHei" w:eastAsia="Microsoft YaHei"/>
-                <w:sz w:val="16"/>
-              </w:rPr>
-              <w:t>12</w:t>
-            </w:r>
-          </w:p>
-        </w:tc>
-        <w:tc>
-          <w:tcPr>
-            <w:tcW w:type="dxa" w:w="3096"/>
-          </w:tcPr>
-          <w:p>
-            <w:pPr>
-              <w:spacing w:after="0"/>
-            </w:pPr>
-            <w:r/>
-            <w:r>
-              <w:rPr>
-                <w:rFonts w:ascii="Microsoft YaHei" w:hAnsi="Microsoft YaHei" w:eastAsia="Microsoft YaHei"/>
-                <w:sz w:val="16"/>
-              </w:rPr>
-              <w:t>开辟中国特色大国外交的新境界 / 构建人类命运共同体的新实践</w:t>
+              <w:t>与发展中国家共享发展新机遇，惠民生增福祉，实现互利共赢</w:t>
+            </w:r>
+          </w:p>
+        </w:tc>
+        <w:tc>
+          <w:tcPr>
+            <w:tcW w:type="dxa" w:w="3096"/>
+          </w:tcPr>
+          <w:p>
+            <w:pPr>
+              <w:spacing w:after="0"/>
+            </w:pPr>
+            <w:r/>
+            <w:r>
+              <w:rPr>
+                <w:rFonts w:ascii="Microsoft YaHei" w:hAnsi="Microsoft YaHei" w:eastAsia="Microsoft YaHei"/>
+                <w:sz w:val="16"/>
+              </w:rPr>
+              <w:t>1</w:t>
+            </w:r>
+          </w:p>
+        </w:tc>
+        <w:tc>
+          <w:tcPr>
+            <w:tcW w:type="dxa" w:w="3096"/>
+          </w:tcPr>
+          <w:p>
+            <w:pPr>
+              <w:spacing w:after="0"/>
+            </w:pPr>
+            <w:r/>
+            <w:r>
+              <w:rPr>
+                <w:rFonts w:ascii="Microsoft YaHei" w:hAnsi="Microsoft YaHei" w:eastAsia="Microsoft YaHei"/>
+                <w:sz w:val="16"/>
+              </w:rPr>
+              <w:t>与发展中国家共享发展新机遇，惠民生增福祉，实现互利共赢</w:t>
             </w:r>
           </w:p>
         </w:tc>
@@ -8688,7 +7836,7 @@
                 <w:rFonts w:ascii="Microsoft YaHei" w:hAnsi="Microsoft YaHei" w:eastAsia="Microsoft YaHei"/>
                 <w:sz w:val="16"/>
               </w:rPr>
-              <w:t>本节点侧重中国主张、中国方案、中国行动、中国外交和中国贡献；若材料重点是国际秩序和治理原则，应回到政治多极化桶。 遇到中国行动、中国方案、中国责任，先写中国定位和政策作用。</w:t>
+              <w:t>遇到中国行动、中国方案、中国责任，先写中国定位和政策作用。</w:t>
             </w:r>
           </w:p>
         </w:tc>
@@ -8708,43 +7856,43 @@
                 <w:rFonts w:ascii="Microsoft YaHei" w:hAnsi="Microsoft YaHei" w:eastAsia="Microsoft YaHei"/>
                 <w:sz w:val="16"/>
               </w:rPr>
-              <w:t>中国作为联合国创始会员国 / 安理会常任理事国；世界上最大的发展中国家 / 国际政治经济格局中的重要力量</w:t>
-            </w:r>
-          </w:p>
-        </w:tc>
-        <w:tc>
-          <w:tcPr>
-            <w:tcW w:type="dxa" w:w="3096"/>
-          </w:tcPr>
-          <w:p>
-            <w:pPr>
-              <w:spacing w:after="0"/>
-            </w:pPr>
-            <w:r/>
-            <w:r>
-              <w:rPr>
-                <w:rFonts w:ascii="Microsoft YaHei" w:hAnsi="Microsoft YaHei" w:eastAsia="Microsoft YaHei"/>
-                <w:sz w:val="16"/>
-              </w:rPr>
-              <w:t>1</w:t>
-            </w:r>
-          </w:p>
-        </w:tc>
-        <w:tc>
-          <w:tcPr>
-            <w:tcW w:type="dxa" w:w="3096"/>
-          </w:tcPr>
-          <w:p>
-            <w:pPr>
-              <w:spacing w:after="0"/>
-            </w:pPr>
-            <w:r/>
-            <w:r>
-              <w:rPr>
-                <w:rFonts w:ascii="Microsoft YaHei" w:hAnsi="Microsoft YaHei" w:eastAsia="Microsoft YaHei"/>
-                <w:sz w:val="16"/>
-              </w:rPr>
-              <w:t>中国作为联合国创始会员国 / 安理会常任理事国；世界上最大的发展中国家 / 国际政治经济格局中的重要力量</w:t>
+              <w:t>中国推动构建人类命运共同体</w:t>
+            </w:r>
+          </w:p>
+        </w:tc>
+        <w:tc>
+          <w:tcPr>
+            <w:tcW w:type="dxa" w:w="3096"/>
+          </w:tcPr>
+          <w:p>
+            <w:pPr>
+              <w:spacing w:after="0"/>
+            </w:pPr>
+            <w:r/>
+            <w:r>
+              <w:rPr>
+                <w:rFonts w:ascii="Microsoft YaHei" w:hAnsi="Microsoft YaHei" w:eastAsia="Microsoft YaHei"/>
+                <w:sz w:val="16"/>
+              </w:rPr>
+              <w:t>12</w:t>
+            </w:r>
+          </w:p>
+        </w:tc>
+        <w:tc>
+          <w:tcPr>
+            <w:tcW w:type="dxa" w:w="3096"/>
+          </w:tcPr>
+          <w:p>
+            <w:pPr>
+              <w:spacing w:after="0"/>
+            </w:pPr>
+            <w:r/>
+            <w:r>
+              <w:rPr>
+                <w:rFonts w:ascii="Microsoft YaHei" w:hAnsi="Microsoft YaHei" w:eastAsia="Microsoft YaHei"/>
+                <w:sz w:val="16"/>
+              </w:rPr>
+              <w:t>开辟中国特色大国外交的新境界 / 构建人类命运共同体的新实践</w:t>
             </w:r>
           </w:p>
         </w:tc>
@@ -8780,7 +7928,7 @@
                 <w:rFonts w:ascii="Microsoft YaHei" w:hAnsi="Microsoft YaHei" w:eastAsia="Microsoft YaHei"/>
                 <w:sz w:val="16"/>
               </w:rPr>
-              <w:t>遇到中国行动、中国方案、中国责任，先写中国定位和政策作用。</w:t>
+              <w:t>本节点侧重中国主张、中国方案、中国行动、中国外交和中国贡献；若材料重点是国际秩序和治理原则，应回到政治多极化桶。 遇到中国行动、中国方案、中国责任，先写中国定位和政策作用。</w:t>
             </w:r>
           </w:p>
         </w:tc>
@@ -8800,7 +7948,7 @@
                 <w:rFonts w:ascii="Microsoft YaHei" w:hAnsi="Microsoft YaHei" w:eastAsia="Microsoft YaHei"/>
                 <w:sz w:val="16"/>
               </w:rPr>
-              <w:t>坚持正确义利观，在发展合作中共享机遇</w:t>
+              <w:t>中国作为联合国创始会员国 / 安理会常任理事国；世界上最大的发展中国家 / 国际政治经济格局中的重要力量</w:t>
             </w:r>
           </w:p>
         </w:tc>
@@ -8836,7 +7984,7 @@
                 <w:rFonts w:ascii="Microsoft YaHei" w:hAnsi="Microsoft YaHei" w:eastAsia="Microsoft YaHei"/>
                 <w:sz w:val="16"/>
               </w:rPr>
-              <w:t>坚持正确的义利观 / 发展合作中共享机遇 / 坚持互利共赢</w:t>
+              <w:t>中国作为联合国创始会员国 / 安理会常任理事国；世界上最大的发展中国家 / 国际政治经济格局中的重要力量</w:t>
             </w:r>
           </w:p>
         </w:tc>
@@ -9008,43 +8156,43 @@
                 <w:rFonts w:ascii="Microsoft YaHei" w:hAnsi="Microsoft YaHei" w:eastAsia="Microsoft YaHei"/>
                 <w:sz w:val="16"/>
               </w:rPr>
-              <w:t>改善发展中国家民生并助力持续发展</w:t>
-            </w:r>
-          </w:p>
-        </w:tc>
-        <w:tc>
-          <w:tcPr>
-            <w:tcW w:type="dxa" w:w="3096"/>
-          </w:tcPr>
-          <w:p>
-            <w:pPr>
-              <w:spacing w:after="0"/>
-            </w:pPr>
-            <w:r/>
-            <w:r>
-              <w:rPr>
-                <w:rFonts w:ascii="Microsoft YaHei" w:hAnsi="Microsoft YaHei" w:eastAsia="Microsoft YaHei"/>
-                <w:sz w:val="16"/>
-              </w:rPr>
-              <w:t>2</w:t>
-            </w:r>
-          </w:p>
-        </w:tc>
-        <w:tc>
-          <w:tcPr>
-            <w:tcW w:type="dxa" w:w="3096"/>
-          </w:tcPr>
-          <w:p>
-            <w:pPr>
-              <w:spacing w:after="0"/>
-            </w:pPr>
-            <w:r/>
-            <w:r>
-              <w:rPr>
-                <w:rFonts w:ascii="Microsoft YaHei" w:hAnsi="Microsoft YaHei" w:eastAsia="Microsoft YaHei"/>
-                <w:sz w:val="16"/>
-              </w:rPr>
-              <w:t>改善发展中国家民生 / 助力发展中国家持续发展</w:t>
+              <w:t>坚持正确义利观，在发展合作中共享机遇</w:t>
+            </w:r>
+          </w:p>
+        </w:tc>
+        <w:tc>
+          <w:tcPr>
+            <w:tcW w:type="dxa" w:w="3096"/>
+          </w:tcPr>
+          <w:p>
+            <w:pPr>
+              <w:spacing w:after="0"/>
+            </w:pPr>
+            <w:r/>
+            <w:r>
+              <w:rPr>
+                <w:rFonts w:ascii="Microsoft YaHei" w:hAnsi="Microsoft YaHei" w:eastAsia="Microsoft YaHei"/>
+                <w:sz w:val="16"/>
+              </w:rPr>
+              <w:t>1</w:t>
+            </w:r>
+          </w:p>
+        </w:tc>
+        <w:tc>
+          <w:tcPr>
+            <w:tcW w:type="dxa" w:w="3096"/>
+          </w:tcPr>
+          <w:p>
+            <w:pPr>
+              <w:spacing w:after="0"/>
+            </w:pPr>
+            <w:r/>
+            <w:r>
+              <w:rPr>
+                <w:rFonts w:ascii="Microsoft YaHei" w:hAnsi="Microsoft YaHei" w:eastAsia="Microsoft YaHei"/>
+                <w:sz w:val="16"/>
+              </w:rPr>
+              <w:t>坚持正确的义利观 / 发展合作中共享机遇 / 坚持互利共赢</w:t>
             </w:r>
           </w:p>
         </w:tc>
@@ -9100,7 +8248,7 @@
                 <w:rFonts w:ascii="Microsoft YaHei" w:hAnsi="Microsoft YaHei" w:eastAsia="Microsoft YaHei"/>
                 <w:sz w:val="16"/>
               </w:rPr>
-              <w:t>民心相通与文明互鉴</w:t>
+              <w:t>改善发展中国家民生并助力持续发展</w:t>
             </w:r>
           </w:p>
         </w:tc>
@@ -9136,7 +8284,7 @@
                 <w:rFonts w:ascii="Microsoft YaHei" w:hAnsi="Microsoft YaHei" w:eastAsia="Microsoft YaHei"/>
                 <w:sz w:val="16"/>
               </w:rPr>
-              <w:t>加强教育文化交流，促进民心相通 / 文化借鉴融合 / 加强团结合作</w:t>
+              <w:t>改善发展中国家民生 / 助力发展中国家持续发展</w:t>
             </w:r>
           </w:p>
         </w:tc>
@@ -9192,43 +8340,43 @@
                 <w:rFonts w:ascii="Microsoft YaHei" w:hAnsi="Microsoft YaHei" w:eastAsia="Microsoft YaHei"/>
                 <w:sz w:val="16"/>
               </w:rPr>
-              <w:t>全球发展倡议：以发展促繁荣</w:t>
-            </w:r>
-          </w:p>
-        </w:tc>
-        <w:tc>
-          <w:tcPr>
-            <w:tcW w:type="dxa" w:w="3096"/>
-          </w:tcPr>
-          <w:p>
-            <w:pPr>
-              <w:spacing w:after="0"/>
-            </w:pPr>
-            <w:r/>
-            <w:r>
-              <w:rPr>
-                <w:rFonts w:ascii="Microsoft YaHei" w:hAnsi="Microsoft YaHei" w:eastAsia="Microsoft YaHei"/>
-                <w:sz w:val="16"/>
-              </w:rPr>
-              <w:t>1</w:t>
-            </w:r>
-          </w:p>
-        </w:tc>
-        <w:tc>
-          <w:tcPr>
-            <w:tcW w:type="dxa" w:w="3096"/>
-          </w:tcPr>
-          <w:p>
-            <w:pPr>
-              <w:spacing w:after="0"/>
-            </w:pPr>
-            <w:r/>
-            <w:r>
-              <w:rPr>
-                <w:rFonts w:ascii="Microsoft YaHei" w:hAnsi="Microsoft YaHei" w:eastAsia="Microsoft YaHei"/>
-                <w:sz w:val="16"/>
-              </w:rPr>
-              <w:t>全球发展倡议：以发展促繁荣</w:t>
+              <w:t>民心相通与文明互鉴</w:t>
+            </w:r>
+          </w:p>
+        </w:tc>
+        <w:tc>
+          <w:tcPr>
+            <w:tcW w:type="dxa" w:w="3096"/>
+          </w:tcPr>
+          <w:p>
+            <w:pPr>
+              <w:spacing w:after="0"/>
+            </w:pPr>
+            <w:r/>
+            <w:r>
+              <w:rPr>
+                <w:rFonts w:ascii="Microsoft YaHei" w:hAnsi="Microsoft YaHei" w:eastAsia="Microsoft YaHei"/>
+                <w:sz w:val="16"/>
+              </w:rPr>
+              <w:t>2</w:t>
+            </w:r>
+          </w:p>
+        </w:tc>
+        <w:tc>
+          <w:tcPr>
+            <w:tcW w:type="dxa" w:w="3096"/>
+          </w:tcPr>
+          <w:p>
+            <w:pPr>
+              <w:spacing w:after="0"/>
+            </w:pPr>
+            <w:r/>
+            <w:r>
+              <w:rPr>
+                <w:rFonts w:ascii="Microsoft YaHei" w:hAnsi="Microsoft YaHei" w:eastAsia="Microsoft YaHei"/>
+                <w:sz w:val="16"/>
+              </w:rPr>
+              <w:t>加强教育文化交流，促进民心相通 / 文化借鉴融合 / 加强团结合作</w:t>
             </w:r>
           </w:p>
         </w:tc>
@@ -9284,43 +8432,43 @@
                 <w:rFonts w:ascii="Microsoft YaHei" w:hAnsi="Microsoft YaHei" w:eastAsia="Microsoft YaHei"/>
                 <w:sz w:val="16"/>
               </w:rPr>
-              <w:t>全球安全倡议：以安全保稳定</w:t>
-            </w:r>
-          </w:p>
-        </w:tc>
-        <w:tc>
-          <w:tcPr>
-            <w:tcW w:type="dxa" w:w="3096"/>
-          </w:tcPr>
-          <w:p>
-            <w:pPr>
-              <w:spacing w:after="0"/>
-            </w:pPr>
-            <w:r/>
-            <w:r>
-              <w:rPr>
-                <w:rFonts w:ascii="Microsoft YaHei" w:hAnsi="Microsoft YaHei" w:eastAsia="Microsoft YaHei"/>
-                <w:sz w:val="16"/>
-              </w:rPr>
-              <w:t>1</w:t>
-            </w:r>
-          </w:p>
-        </w:tc>
-        <w:tc>
-          <w:tcPr>
-            <w:tcW w:type="dxa" w:w="3096"/>
-          </w:tcPr>
-          <w:p>
-            <w:pPr>
-              <w:spacing w:after="0"/>
-            </w:pPr>
-            <w:r/>
-            <w:r>
-              <w:rPr>
-                <w:rFonts w:ascii="Microsoft YaHei" w:hAnsi="Microsoft YaHei" w:eastAsia="Microsoft YaHei"/>
-                <w:sz w:val="16"/>
-              </w:rPr>
-              <w:t>全球安全倡议：以安全保稳定</w:t>
+              <w:t>全球发展倡议：以发展促繁荣</w:t>
+            </w:r>
+          </w:p>
+        </w:tc>
+        <w:tc>
+          <w:tcPr>
+            <w:tcW w:type="dxa" w:w="3096"/>
+          </w:tcPr>
+          <w:p>
+            <w:pPr>
+              <w:spacing w:after="0"/>
+            </w:pPr>
+            <w:r/>
+            <w:r>
+              <w:rPr>
+                <w:rFonts w:ascii="Microsoft YaHei" w:hAnsi="Microsoft YaHei" w:eastAsia="Microsoft YaHei"/>
+                <w:sz w:val="16"/>
+              </w:rPr>
+              <w:t>2</w:t>
+            </w:r>
+          </w:p>
+        </w:tc>
+        <w:tc>
+          <w:tcPr>
+            <w:tcW w:type="dxa" w:w="3096"/>
+          </w:tcPr>
+          <w:p>
+            <w:pPr>
+              <w:spacing w:after="0"/>
+            </w:pPr>
+            <w:r/>
+            <w:r>
+              <w:rPr>
+                <w:rFonts w:ascii="Microsoft YaHei" w:hAnsi="Microsoft YaHei" w:eastAsia="Microsoft YaHei"/>
+                <w:sz w:val="16"/>
+              </w:rPr>
+              <w:t>全球发展倡议：以发展促繁荣</w:t>
             </w:r>
           </w:p>
         </w:tc>
@@ -9376,43 +8524,43 @@
                 <w:rFonts w:ascii="Microsoft YaHei" w:hAnsi="Microsoft YaHei" w:eastAsia="Microsoft YaHei"/>
                 <w:sz w:val="16"/>
               </w:rPr>
-              <w:t>全球文明倡议：以文明增互信</w:t>
-            </w:r>
-          </w:p>
-        </w:tc>
-        <w:tc>
-          <w:tcPr>
-            <w:tcW w:type="dxa" w:w="3096"/>
-          </w:tcPr>
-          <w:p>
-            <w:pPr>
-              <w:spacing w:after="0"/>
-            </w:pPr>
-            <w:r/>
-            <w:r>
-              <w:rPr>
-                <w:rFonts w:ascii="Microsoft YaHei" w:hAnsi="Microsoft YaHei" w:eastAsia="Microsoft YaHei"/>
-                <w:sz w:val="16"/>
-              </w:rPr>
-              <w:t>1</w:t>
-            </w:r>
-          </w:p>
-        </w:tc>
-        <w:tc>
-          <w:tcPr>
-            <w:tcW w:type="dxa" w:w="3096"/>
-          </w:tcPr>
-          <w:p>
-            <w:pPr>
-              <w:spacing w:after="0"/>
-            </w:pPr>
-            <w:r/>
-            <w:r>
-              <w:rPr>
-                <w:rFonts w:ascii="Microsoft YaHei" w:hAnsi="Microsoft YaHei" w:eastAsia="Microsoft YaHei"/>
-                <w:sz w:val="16"/>
-              </w:rPr>
-              <w:t>全球文明倡议：以文明增互信</w:t>
+              <w:t>全球安全倡议：以安全保稳定</w:t>
+            </w:r>
+          </w:p>
+        </w:tc>
+        <w:tc>
+          <w:tcPr>
+            <w:tcW w:type="dxa" w:w="3096"/>
+          </w:tcPr>
+          <w:p>
+            <w:pPr>
+              <w:spacing w:after="0"/>
+            </w:pPr>
+            <w:r/>
+            <w:r>
+              <w:rPr>
+                <w:rFonts w:ascii="Microsoft YaHei" w:hAnsi="Microsoft YaHei" w:eastAsia="Microsoft YaHei"/>
+                <w:sz w:val="16"/>
+              </w:rPr>
+              <w:t>2</w:t>
+            </w:r>
+          </w:p>
+        </w:tc>
+        <w:tc>
+          <w:tcPr>
+            <w:tcW w:type="dxa" w:w="3096"/>
+          </w:tcPr>
+          <w:p>
+            <w:pPr>
+              <w:spacing w:after="0"/>
+            </w:pPr>
+            <w:r/>
+            <w:r>
+              <w:rPr>
+                <w:rFonts w:ascii="Microsoft YaHei" w:hAnsi="Microsoft YaHei" w:eastAsia="Microsoft YaHei"/>
+                <w:sz w:val="16"/>
+              </w:rPr>
+              <w:t>全球安全倡议：以安全保稳定</w:t>
             </w:r>
           </w:p>
         </w:tc>
@@ -9468,43 +8616,43 @@
                 <w:rFonts w:ascii="Microsoft YaHei" w:hAnsi="Microsoft YaHei" w:eastAsia="Microsoft YaHei"/>
                 <w:sz w:val="16"/>
               </w:rPr>
-              <w:t>全球治理倡议：以治理求公正</w:t>
-            </w:r>
-          </w:p>
-        </w:tc>
-        <w:tc>
-          <w:tcPr>
-            <w:tcW w:type="dxa" w:w="3096"/>
-          </w:tcPr>
-          <w:p>
-            <w:pPr>
-              <w:spacing w:after="0"/>
-            </w:pPr>
-            <w:r/>
-            <w:r>
-              <w:rPr>
-                <w:rFonts w:ascii="Microsoft YaHei" w:hAnsi="Microsoft YaHei" w:eastAsia="Microsoft YaHei"/>
-                <w:sz w:val="16"/>
-              </w:rPr>
-              <w:t>1</w:t>
-            </w:r>
-          </w:p>
-        </w:tc>
-        <w:tc>
-          <w:tcPr>
-            <w:tcW w:type="dxa" w:w="3096"/>
-          </w:tcPr>
-          <w:p>
-            <w:pPr>
-              <w:spacing w:after="0"/>
-            </w:pPr>
-            <w:r/>
-            <w:r>
-              <w:rPr>
-                <w:rFonts w:ascii="Microsoft YaHei" w:hAnsi="Microsoft YaHei" w:eastAsia="Microsoft YaHei"/>
-                <w:sz w:val="16"/>
-              </w:rPr>
-              <w:t>全球治理倡议：以治理求公正</w:t>
+              <w:t>全球文明倡议：以文明增互信</w:t>
+            </w:r>
+          </w:p>
+        </w:tc>
+        <w:tc>
+          <w:tcPr>
+            <w:tcW w:type="dxa" w:w="3096"/>
+          </w:tcPr>
+          <w:p>
+            <w:pPr>
+              <w:spacing w:after="0"/>
+            </w:pPr>
+            <w:r/>
+            <w:r>
+              <w:rPr>
+                <w:rFonts w:ascii="Microsoft YaHei" w:hAnsi="Microsoft YaHei" w:eastAsia="Microsoft YaHei"/>
+                <w:sz w:val="16"/>
+              </w:rPr>
+              <w:t>2</w:t>
+            </w:r>
+          </w:p>
+        </w:tc>
+        <w:tc>
+          <w:tcPr>
+            <w:tcW w:type="dxa" w:w="3096"/>
+          </w:tcPr>
+          <w:p>
+            <w:pPr>
+              <w:spacing w:after="0"/>
+            </w:pPr>
+            <w:r/>
+            <w:r>
+              <w:rPr>
+                <w:rFonts w:ascii="Microsoft YaHei" w:hAnsi="Microsoft YaHei" w:eastAsia="Microsoft YaHei"/>
+                <w:sz w:val="16"/>
+              </w:rPr>
+              <w:t>全球文明倡议：以文明增互信</w:t>
             </w:r>
           </w:p>
         </w:tc>
@@ -9560,7 +8708,7 @@
                 <w:rFonts w:ascii="Microsoft YaHei" w:hAnsi="Microsoft YaHei" w:eastAsia="Microsoft YaHei"/>
                 <w:sz w:val="16"/>
               </w:rPr>
-              <w:t>从中国主张到国际共识，从合作理念到共同行动</w:t>
+              <w:t>全球治理倡议：以治理求公正</w:t>
             </w:r>
           </w:p>
         </w:tc>
@@ -9596,7 +8744,7 @@
                 <w:rFonts w:ascii="Microsoft YaHei" w:hAnsi="Microsoft YaHei" w:eastAsia="Microsoft YaHei"/>
                 <w:sz w:val="16"/>
               </w:rPr>
-              <w:t>从中国主张到国际共识，从合作理念到共同行动</w:t>
+              <w:t>全球治理倡议：以治理求公正</w:t>
             </w:r>
           </w:p>
         </w:tc>
@@ -9652,43 +8800,43 @@
                 <w:rFonts w:ascii="Microsoft YaHei" w:hAnsi="Microsoft YaHei" w:eastAsia="Microsoft YaHei"/>
                 <w:sz w:val="16"/>
               </w:rPr>
-              <w:t>南南合作与全球南方共同发展</w:t>
-            </w:r>
-          </w:p>
-        </w:tc>
-        <w:tc>
-          <w:tcPr>
-            <w:tcW w:type="dxa" w:w="3096"/>
-          </w:tcPr>
-          <w:p>
-            <w:pPr>
-              <w:spacing w:after="0"/>
-            </w:pPr>
-            <w:r/>
-            <w:r>
-              <w:rPr>
-                <w:rFonts w:ascii="Microsoft YaHei" w:hAnsi="Microsoft YaHei" w:eastAsia="Microsoft YaHei"/>
-                <w:sz w:val="16"/>
-              </w:rPr>
-              <w:t>2</w:t>
-            </w:r>
-          </w:p>
-        </w:tc>
-        <w:tc>
-          <w:tcPr>
-            <w:tcW w:type="dxa" w:w="3096"/>
-          </w:tcPr>
-          <w:p>
-            <w:pPr>
-              <w:spacing w:after="0"/>
-            </w:pPr>
-            <w:r/>
-            <w:r>
-              <w:rPr>
-                <w:rFonts w:ascii="Microsoft YaHei" w:hAnsi="Microsoft YaHei" w:eastAsia="Microsoft YaHei"/>
-                <w:sz w:val="16"/>
-              </w:rPr>
-              <w:t>中国作为世界上最大的发展中国家，是国际政治经济格局中一支重要力量，积极参与全球治理，为推动全球南方实现现代化发挥作用</w:t>
+              <w:t>从中国主张到国际共识，从合作理念到共同行动</w:t>
+            </w:r>
+          </w:p>
+        </w:tc>
+        <w:tc>
+          <w:tcPr>
+            <w:tcW w:type="dxa" w:w="3096"/>
+          </w:tcPr>
+          <w:p>
+            <w:pPr>
+              <w:spacing w:after="0"/>
+            </w:pPr>
+            <w:r/>
+            <w:r>
+              <w:rPr>
+                <w:rFonts w:ascii="Microsoft YaHei" w:hAnsi="Microsoft YaHei" w:eastAsia="Microsoft YaHei"/>
+                <w:sz w:val="16"/>
+              </w:rPr>
+              <w:t>1</w:t>
+            </w:r>
+          </w:p>
+        </w:tc>
+        <w:tc>
+          <w:tcPr>
+            <w:tcW w:type="dxa" w:w="3096"/>
+          </w:tcPr>
+          <w:p>
+            <w:pPr>
+              <w:spacing w:after="0"/>
+            </w:pPr>
+            <w:r/>
+            <w:r>
+              <w:rPr>
+                <w:rFonts w:ascii="Microsoft YaHei" w:hAnsi="Microsoft YaHei" w:eastAsia="Microsoft YaHei"/>
+                <w:sz w:val="16"/>
+              </w:rPr>
+              <w:t>从中国主张到国际共识，从合作理念到共同行动</w:t>
             </w:r>
           </w:p>
         </w:tc>
@@ -9744,43 +8892,43 @@
                 <w:rFonts w:ascii="Microsoft YaHei" w:hAnsi="Microsoft YaHei" w:eastAsia="Microsoft YaHei"/>
                 <w:sz w:val="16"/>
               </w:rPr>
-              <w:t>中国积极参与国际组织，在联合国、金砖国家、二十国集团、博鳌亚洲论坛等国际组织中的作用日益显著，已成为全球治理体系的重要参与者、贡献者和改革者</w:t>
-            </w:r>
-          </w:p>
-        </w:tc>
-        <w:tc>
-          <w:tcPr>
-            <w:tcW w:type="dxa" w:w="3096"/>
-          </w:tcPr>
-          <w:p>
-            <w:pPr>
-              <w:spacing w:after="0"/>
-            </w:pPr>
-            <w:r/>
-            <w:r>
-              <w:rPr>
-                <w:rFonts w:ascii="Microsoft YaHei" w:hAnsi="Microsoft YaHei" w:eastAsia="Microsoft YaHei"/>
-                <w:sz w:val="16"/>
-              </w:rPr>
-              <w:t>1</w:t>
-            </w:r>
-          </w:p>
-        </w:tc>
-        <w:tc>
-          <w:tcPr>
-            <w:tcW w:type="dxa" w:w="3096"/>
-          </w:tcPr>
-          <w:p>
-            <w:pPr>
-              <w:spacing w:after="0"/>
-            </w:pPr>
-            <w:r/>
-            <w:r>
-              <w:rPr>
-                <w:rFonts w:ascii="Microsoft YaHei" w:hAnsi="Microsoft YaHei" w:eastAsia="Microsoft YaHei"/>
-                <w:sz w:val="16"/>
-              </w:rPr>
-              <w:t>中国积极参与国际组织，在联合国、金砖国家、二十国集团、博鳌亚洲论坛等国际组织中的作用日益显著，已成为全球治理体系的重要参与者、贡献者和改革者</w:t>
+              <w:t>南南合作与全球南方共同发展</w:t>
+            </w:r>
+          </w:p>
+        </w:tc>
+        <w:tc>
+          <w:tcPr>
+            <w:tcW w:type="dxa" w:w="3096"/>
+          </w:tcPr>
+          <w:p>
+            <w:pPr>
+              <w:spacing w:after="0"/>
+            </w:pPr>
+            <w:r/>
+            <w:r>
+              <w:rPr>
+                <w:rFonts w:ascii="Microsoft YaHei" w:hAnsi="Microsoft YaHei" w:eastAsia="Microsoft YaHei"/>
+                <w:sz w:val="16"/>
+              </w:rPr>
+              <w:t>2</w:t>
+            </w:r>
+          </w:p>
+        </w:tc>
+        <w:tc>
+          <w:tcPr>
+            <w:tcW w:type="dxa" w:w="3096"/>
+          </w:tcPr>
+          <w:p>
+            <w:pPr>
+              <w:spacing w:after="0"/>
+            </w:pPr>
+            <w:r/>
+            <w:r>
+              <w:rPr>
+                <w:rFonts w:ascii="Microsoft YaHei" w:hAnsi="Microsoft YaHei" w:eastAsia="Microsoft YaHei"/>
+                <w:sz w:val="16"/>
+              </w:rPr>
+              <w:t>中国作为世界上最大的发展中国家，是国际政治经济格局中一支重要力量，积极参与全球治理，为推动全球南方实现现代化发挥作用</w:t>
             </w:r>
           </w:p>
         </w:tc>
@@ -9836,43 +8984,43 @@
                 <w:rFonts w:ascii="Microsoft YaHei" w:hAnsi="Microsoft YaHei" w:eastAsia="Microsoft YaHei"/>
                 <w:sz w:val="16"/>
               </w:rPr>
-              <w:t>中国推进绿色低碳转型并参与全球气候治理</w:t>
-            </w:r>
-          </w:p>
-        </w:tc>
-        <w:tc>
-          <w:tcPr>
-            <w:tcW w:type="dxa" w:w="3096"/>
-          </w:tcPr>
-          <w:p>
-            <w:pPr>
-              <w:spacing w:after="0"/>
-            </w:pPr>
-            <w:r/>
-            <w:r>
-              <w:rPr>
-                <w:rFonts w:ascii="Microsoft YaHei" w:hAnsi="Microsoft YaHei" w:eastAsia="Microsoft YaHei"/>
-                <w:sz w:val="16"/>
-              </w:rPr>
-              <w:t>3</w:t>
-            </w:r>
-          </w:p>
-        </w:tc>
-        <w:tc>
-          <w:tcPr>
-            <w:tcW w:type="dxa" w:w="3096"/>
-          </w:tcPr>
-          <w:p>
-            <w:pPr>
-              <w:spacing w:after="0"/>
-            </w:pPr>
-            <w:r/>
-            <w:r>
-              <w:rPr>
-                <w:rFonts w:ascii="Microsoft YaHei" w:hAnsi="Microsoft YaHei" w:eastAsia="Microsoft YaHei"/>
-                <w:sz w:val="16"/>
-              </w:rPr>
-              <w:t>推进绿色低碳发展转型；以实际行动应对气候变化</w:t>
+              <w:t>中国积极参与国际组织，在联合国、金砖国家、二十国集团、博鳌亚洲论坛等国际组织中的作用日益显著，已成为全球治理体系的重要参与者、贡献者和改革者</w:t>
+            </w:r>
+          </w:p>
+        </w:tc>
+        <w:tc>
+          <w:tcPr>
+            <w:tcW w:type="dxa" w:w="3096"/>
+          </w:tcPr>
+          <w:p>
+            <w:pPr>
+              <w:spacing w:after="0"/>
+            </w:pPr>
+            <w:r/>
+            <w:r>
+              <w:rPr>
+                <w:rFonts w:ascii="Microsoft YaHei" w:hAnsi="Microsoft YaHei" w:eastAsia="Microsoft YaHei"/>
+                <w:sz w:val="16"/>
+              </w:rPr>
+              <w:t>1</w:t>
+            </w:r>
+          </w:p>
+        </w:tc>
+        <w:tc>
+          <w:tcPr>
+            <w:tcW w:type="dxa" w:w="3096"/>
+          </w:tcPr>
+          <w:p>
+            <w:pPr>
+              <w:spacing w:after="0"/>
+            </w:pPr>
+            <w:r/>
+            <w:r>
+              <w:rPr>
+                <w:rFonts w:ascii="Microsoft YaHei" w:hAnsi="Microsoft YaHei" w:eastAsia="Microsoft YaHei"/>
+                <w:sz w:val="16"/>
+              </w:rPr>
+              <w:t>中国积极参与国际组织，在联合国、金砖国家、二十国集团、博鳌亚洲论坛等国际组织中的作用日益显著，已成为全球治理体系的重要参与者、贡献者和改革者</w:t>
             </w:r>
           </w:p>
         </w:tc>
@@ -10044,7 +9192,7 @@
                 <w:rFonts w:ascii="Microsoft YaHei" w:hAnsi="Microsoft YaHei" w:eastAsia="Microsoft YaHei"/>
                 <w:sz w:val="16"/>
               </w:rPr>
-              <w:t>中国是负责任大国并勇于担当</w:t>
+              <w:t>中国推进绿色低碳转型并参与全球气候治理</w:t>
             </w:r>
           </w:p>
         </w:tc>
@@ -10080,7 +9228,7 @@
                 <w:rFonts w:ascii="Microsoft YaHei" w:hAnsi="Microsoft YaHei" w:eastAsia="Microsoft YaHei"/>
                 <w:sz w:val="16"/>
               </w:rPr>
-              <w:t>主动担当全球气候治理责任；展现负责任大国担当</w:t>
+              <w:t>推进绿色低碳发展转型；以实际行动应对气候变化</w:t>
             </w:r>
           </w:p>
         </w:tc>
@@ -10136,43 +9284,43 @@
                 <w:rFonts w:ascii="Microsoft YaHei" w:hAnsi="Microsoft YaHei" w:eastAsia="Microsoft YaHei"/>
                 <w:sz w:val="16"/>
               </w:rPr>
-              <w:t>坚持独立自主、自力更生，增强发展主动权</w:t>
-            </w:r>
-          </w:p>
-        </w:tc>
-        <w:tc>
-          <w:tcPr>
-            <w:tcW w:type="dxa" w:w="3096"/>
-          </w:tcPr>
-          <w:p>
-            <w:pPr>
-              <w:spacing w:after="0"/>
-            </w:pPr>
-            <w:r/>
-            <w:r>
-              <w:rPr>
-                <w:rFonts w:ascii="Microsoft YaHei" w:hAnsi="Microsoft YaHei" w:eastAsia="Microsoft YaHei"/>
-                <w:sz w:val="16"/>
-              </w:rPr>
-              <w:t>2</w:t>
-            </w:r>
-          </w:p>
-        </w:tc>
-        <w:tc>
-          <w:tcPr>
-            <w:tcW w:type="dxa" w:w="3096"/>
-          </w:tcPr>
-          <w:p>
-            <w:pPr>
-              <w:spacing w:after="0"/>
-            </w:pPr>
-            <w:r/>
-            <w:r>
-              <w:rPr>
-                <w:rFonts w:ascii="Microsoft YaHei" w:hAnsi="Microsoft YaHei" w:eastAsia="Microsoft YaHei"/>
-                <w:sz w:val="16"/>
-              </w:rPr>
-              <w:t>坚持独立自主，增强自主创新能力，实现关键核心技术自主可控，把发展主动权牢牢掌握在自己手中</w:t>
+              <w:t>中国是负责任大国并勇于担当</w:t>
+            </w:r>
+          </w:p>
+        </w:tc>
+        <w:tc>
+          <w:tcPr>
+            <w:tcW w:type="dxa" w:w="3096"/>
+          </w:tcPr>
+          <w:p>
+            <w:pPr>
+              <w:spacing w:after="0"/>
+            </w:pPr>
+            <w:r/>
+            <w:r>
+              <w:rPr>
+                <w:rFonts w:ascii="Microsoft YaHei" w:hAnsi="Microsoft YaHei" w:eastAsia="Microsoft YaHei"/>
+                <w:sz w:val="16"/>
+              </w:rPr>
+              <w:t>5</w:t>
+            </w:r>
+          </w:p>
+        </w:tc>
+        <w:tc>
+          <w:tcPr>
+            <w:tcW w:type="dxa" w:w="3096"/>
+          </w:tcPr>
+          <w:p>
+            <w:pPr>
+              <w:spacing w:after="0"/>
+            </w:pPr>
+            <w:r/>
+            <w:r>
+              <w:rPr>
+                <w:rFonts w:ascii="Microsoft YaHei" w:hAnsi="Microsoft YaHei" w:eastAsia="Microsoft YaHei"/>
+                <w:sz w:val="16"/>
+              </w:rPr>
+              <w:t>主动担当全球气候治理责任；展现负责任大国担当</w:t>
             </w:r>
           </w:p>
         </w:tc>
@@ -10228,43 +9376,43 @@
                 <w:rFonts w:ascii="Microsoft YaHei" w:hAnsi="Microsoft YaHei" w:eastAsia="Microsoft YaHei"/>
                 <w:sz w:val="16"/>
               </w:rPr>
-              <w:t>坚持总体国家安全观，统筹发展与安全，以新安全格局保障新发展格局</w:t>
-            </w:r>
-          </w:p>
-        </w:tc>
-        <w:tc>
-          <w:tcPr>
-            <w:tcW w:type="dxa" w:w="3096"/>
-          </w:tcPr>
-          <w:p>
-            <w:pPr>
-              <w:spacing w:after="0"/>
-            </w:pPr>
-            <w:r/>
-            <w:r>
-              <w:rPr>
-                <w:rFonts w:ascii="Microsoft YaHei" w:hAnsi="Microsoft YaHei" w:eastAsia="Microsoft YaHei"/>
-                <w:sz w:val="16"/>
-              </w:rPr>
-              <w:t>1</w:t>
-            </w:r>
-          </w:p>
-        </w:tc>
-        <w:tc>
-          <w:tcPr>
-            <w:tcW w:type="dxa" w:w="3096"/>
-          </w:tcPr>
-          <w:p>
-            <w:pPr>
-              <w:spacing w:after="0"/>
-            </w:pPr>
-            <w:r/>
-            <w:r>
-              <w:rPr>
-                <w:rFonts w:ascii="Microsoft YaHei" w:hAnsi="Microsoft YaHei" w:eastAsia="Microsoft YaHei"/>
-                <w:sz w:val="16"/>
-              </w:rPr>
-              <w:t>坚持总体国家安全观，统筹发展与安全，以新安全格局保障新发展格局</w:t>
+              <w:t>坚持独立自主、自力更生，增强发展主动权</w:t>
+            </w:r>
+          </w:p>
+        </w:tc>
+        <w:tc>
+          <w:tcPr>
+            <w:tcW w:type="dxa" w:w="3096"/>
+          </w:tcPr>
+          <w:p>
+            <w:pPr>
+              <w:spacing w:after="0"/>
+            </w:pPr>
+            <w:r/>
+            <w:r>
+              <w:rPr>
+                <w:rFonts w:ascii="Microsoft YaHei" w:hAnsi="Microsoft YaHei" w:eastAsia="Microsoft YaHei"/>
+                <w:sz w:val="16"/>
+              </w:rPr>
+              <w:t>2</w:t>
+            </w:r>
+          </w:p>
+        </w:tc>
+        <w:tc>
+          <w:tcPr>
+            <w:tcW w:type="dxa" w:w="3096"/>
+          </w:tcPr>
+          <w:p>
+            <w:pPr>
+              <w:spacing w:after="0"/>
+            </w:pPr>
+            <w:r/>
+            <w:r>
+              <w:rPr>
+                <w:rFonts w:ascii="Microsoft YaHei" w:hAnsi="Microsoft YaHei" w:eastAsia="Microsoft YaHei"/>
+                <w:sz w:val="16"/>
+              </w:rPr>
+              <w:t>坚持独立自主，增强自主创新能力，实现关键核心技术自主可控，把发展主动权牢牢掌握在自己手中</w:t>
             </w:r>
           </w:p>
         </w:tc>
@@ -10430,25 +9578,25 @@
                 <w:rFonts w:ascii="Microsoft YaHei" w:hAnsi="Microsoft YaHei" w:eastAsia="Microsoft YaHei"/>
                 <w:sz w:val="16"/>
               </w:rPr>
-              <w:t>1</w:t>
-            </w:r>
-          </w:p>
-        </w:tc>
-        <w:tc>
-          <w:tcPr>
-            <w:tcW w:type="dxa" w:w="3096"/>
-          </w:tcPr>
-          <w:p>
-            <w:pPr>
-              <w:spacing w:after="0"/>
-            </w:pPr>
-            <w:r/>
-            <w:r>
-              <w:rPr>
-                <w:rFonts w:ascii="Microsoft YaHei" w:hAnsi="Microsoft YaHei" w:eastAsia="Microsoft YaHei"/>
-                <w:sz w:val="16"/>
-              </w:rPr>
-              <w:t>促进技术共享和民生改善；为全球可持续发展贡献力量</w:t>
+              <w:t>2</w:t>
+            </w:r>
+          </w:p>
+        </w:tc>
+        <w:tc>
+          <w:tcPr>
+            <w:tcW w:type="dxa" w:w="3096"/>
+          </w:tcPr>
+          <w:p>
+            <w:pPr>
+              <w:spacing w:after="0"/>
+            </w:pPr>
+            <w:r/>
+            <w:r>
+              <w:rPr>
+                <w:rFonts w:ascii="Microsoft YaHei" w:hAnsi="Microsoft YaHei" w:eastAsia="Microsoft YaHei"/>
+                <w:sz w:val="16"/>
+              </w:rPr>
+              <w:t>以科技助力发展中国家发展；提升其自主发展能力；促进民生改善</w:t>
             </w:r>
           </w:p>
         </w:tc>
@@ -10633,6 +9781,98 @@
                 <w:sz w:val="16"/>
               </w:rPr>
               <w:t>聚焦发展中国家紧迫需求；灵活实施；快速响应基层社区需求；规模小更易统筹、可推广，形成品牌和共同发展目标</w:t>
+            </w:r>
+          </w:p>
+        </w:tc>
+        <w:tc>
+          <w:tcPr>
+            <w:tcW w:type="dxa" w:w="3096"/>
+          </w:tcPr>
+          <w:p>
+            <w:pPr>
+              <w:spacing w:after="0"/>
+            </w:pPr>
+            <w:r/>
+            <w:r>
+              <w:rPr>
+                <w:rFonts w:ascii="Microsoft YaHei" w:hAnsi="Microsoft YaHei" w:eastAsia="Microsoft YaHei"/>
+                <w:sz w:val="16"/>
+              </w:rPr>
+              <w:t>同名二级标题</w:t>
+            </w:r>
+          </w:p>
+        </w:tc>
+        <w:tc>
+          <w:tcPr>
+            <w:tcW w:type="dxa" w:w="3096"/>
+          </w:tcPr>
+          <w:p>
+            <w:pPr>
+              <w:spacing w:after="0"/>
+            </w:pPr>
+            <w:r/>
+            <w:r>
+              <w:rPr>
+                <w:rFonts w:ascii="Microsoft YaHei" w:hAnsi="Microsoft YaHei" w:eastAsia="Microsoft YaHei"/>
+                <w:sz w:val="16"/>
+              </w:rPr>
+              <w:t>遇到中国行动、中国方案、中国责任，先写中国定位和政策作用。</w:t>
+            </w:r>
+          </w:p>
+        </w:tc>
+      </w:tr>
+      <w:tr>
+        <w:tc>
+          <w:tcPr>
+            <w:tcW w:type="dxa" w:w="3096"/>
+          </w:tcPr>
+          <w:p>
+            <w:pPr>
+              <w:spacing w:after="0"/>
+            </w:pPr>
+            <w:r/>
+            <w:r>
+              <w:rPr>
+                <w:rFonts w:ascii="Microsoft YaHei" w:hAnsi="Microsoft YaHei" w:eastAsia="Microsoft YaHei"/>
+                <w:sz w:val="16"/>
+              </w:rPr>
+              <w:t>理念蕴含普遍价值，能够形成共识、促成合作和发展、应对全人类共同问题和共同挑战</w:t>
+            </w:r>
+          </w:p>
+        </w:tc>
+        <w:tc>
+          <w:tcPr>
+            <w:tcW w:type="dxa" w:w="3096"/>
+          </w:tcPr>
+          <w:p>
+            <w:pPr>
+              <w:spacing w:after="0"/>
+            </w:pPr>
+            <w:r/>
+            <w:r>
+              <w:rPr>
+                <w:rFonts w:ascii="Microsoft YaHei" w:hAnsi="Microsoft YaHei" w:eastAsia="Microsoft YaHei"/>
+                <w:sz w:val="16"/>
+              </w:rPr>
+              <w:t>1</w:t>
+            </w:r>
+          </w:p>
+        </w:tc>
+        <w:tc>
+          <w:tcPr>
+            <w:tcW w:type="dxa" w:w="3096"/>
+          </w:tcPr>
+          <w:p>
+            <w:pPr>
+              <w:spacing w:after="0"/>
+            </w:pPr>
+            <w:r/>
+            <w:r>
+              <w:rPr>
+                <w:rFonts w:ascii="Microsoft YaHei" w:hAnsi="Microsoft YaHei" w:eastAsia="Microsoft YaHei"/>
+                <w:sz w:val="16"/>
+              </w:rPr>
+              <w:t>理念蕴含普遍价值，能够形成共识、促成合作和发展、应对全人类共同问题和共同挑战</w:t>
             </w:r>
           </w:p>
         </w:tc>
@@ -10969,98 +10209,6 @@
                 <w:sz w:val="16"/>
               </w:rPr>
               <w:t>联合国是当今世界最具普遍性、代表性和权威性的政府间国际组织；集体安全机制的核心；实践多边主义的最佳场所；发展与和平、人权三大支柱维护世界和平、推动共同发展、促进人类文明进步</w:t>
-            </w:r>
-          </w:p>
-        </w:tc>
-        <w:tc>
-          <w:tcPr>
-            <w:tcW w:type="dxa" w:w="3096"/>
-          </w:tcPr>
-          <w:p>
-            <w:pPr>
-              <w:spacing w:after="0"/>
-            </w:pPr>
-            <w:r/>
-            <w:r>
-              <w:rPr>
-                <w:rFonts w:ascii="Microsoft YaHei" w:hAnsi="Microsoft YaHei" w:eastAsia="Microsoft YaHei"/>
-                <w:sz w:val="16"/>
-              </w:rPr>
-              <w:t>同名二级标题</w:t>
-            </w:r>
-          </w:p>
-        </w:tc>
-        <w:tc>
-          <w:tcPr>
-            <w:tcW w:type="dxa" w:w="3096"/>
-          </w:tcPr>
-          <w:p>
-            <w:pPr>
-              <w:spacing w:after="0"/>
-            </w:pPr>
-            <w:r/>
-            <w:r>
-              <w:rPr>
-                <w:rFonts w:ascii="Microsoft YaHei" w:hAnsi="Microsoft YaHei" w:eastAsia="Microsoft YaHei"/>
-                <w:sz w:val="16"/>
-              </w:rPr>
-              <w:t>遇到联合国、宪章、2030议程和多边场域，先写联合国框架。</w:t>
-            </w:r>
-          </w:p>
-        </w:tc>
-      </w:tr>
-      <w:tr>
-        <w:tc>
-          <w:tcPr>
-            <w:tcW w:type="dxa" w:w="3096"/>
-          </w:tcPr>
-          <w:p>
-            <w:pPr>
-              <w:spacing w:after="0"/>
-            </w:pPr>
-            <w:r/>
-            <w:r>
-              <w:rPr>
-                <w:rFonts w:ascii="Microsoft YaHei" w:hAnsi="Microsoft YaHei" w:eastAsia="Microsoft YaHei"/>
-                <w:sz w:val="16"/>
-              </w:rPr>
-              <w:t>严格落实《巴黎协定》要求；每五年提交国家自主贡献目标；维护全球气候治理多边进程</w:t>
-            </w:r>
-          </w:p>
-        </w:tc>
-        <w:tc>
-          <w:tcPr>
-            <w:tcW w:type="dxa" w:w="3096"/>
-          </w:tcPr>
-          <w:p>
-            <w:pPr>
-              <w:spacing w:after="0"/>
-            </w:pPr>
-            <w:r/>
-            <w:r>
-              <w:rPr>
-                <w:rFonts w:ascii="Microsoft YaHei" w:hAnsi="Microsoft YaHei" w:eastAsia="Microsoft YaHei"/>
-                <w:sz w:val="16"/>
-              </w:rPr>
-              <w:t>1</w:t>
-            </w:r>
-          </w:p>
-        </w:tc>
-        <w:tc>
-          <w:tcPr>
-            <w:tcW w:type="dxa" w:w="3096"/>
-          </w:tcPr>
-          <w:p>
-            <w:pPr>
-              <w:spacing w:after="0"/>
-            </w:pPr>
-            <w:r/>
-            <w:r>
-              <w:rPr>
-                <w:rFonts w:ascii="Microsoft YaHei" w:hAnsi="Microsoft YaHei" w:eastAsia="Microsoft YaHei"/>
-                <w:sz w:val="16"/>
-              </w:rPr>
-              <w:t>严格落实《巴黎协定》要求；每五年提交国家自主贡献目标；维护全球气候治理多边进程</w:t>
             </w:r>
           </w:p>
         </w:tc>

</xml_diff>

<commit_message>
Finalize strict xuanbiyi handbook rebuild
</commit_message>
<xml_diff>
--- a/reports/选必一_哲学宝典式重建_2026-05-16/06_final_handbook/选必一_当代国际政治与经济_主观题术语宝典_考前导航版.docx
+++ b/reports/选必一_哲学宝典式重建_2026-05-16/06_final_handbook/选必一_当代国际政治与经济_主观题术语宝典_考前导航版.docx
@@ -303,7 +303,7 @@
                 <w:rFonts w:ascii="宋体" w:hAnsi="宋体" w:eastAsia="宋体"/>
                 <w:sz w:val="19"/>
               </w:rPr>
-              <w:t>12</w:t>
+              <w:t>17</w:t>
             </w:r>
           </w:p>
         </w:tc>
@@ -873,7 +873,7 @@
                 <w:rFonts w:ascii="宋体" w:hAnsi="宋体" w:eastAsia="宋体"/>
                 <w:sz w:val="19"/>
               </w:rPr>
-              <w:t>6</w:t>
+              <w:t>7</w:t>
             </w:r>
           </w:p>
         </w:tc>
@@ -995,7 +995,7 @@
                 <w:rFonts w:ascii="宋体" w:hAnsi="宋体" w:eastAsia="宋体"/>
                 <w:sz w:val="19"/>
               </w:rPr>
-              <w:t>6</w:t>
+              <w:t>8</w:t>
             </w:r>
           </w:p>
         </w:tc>
@@ -1809,7 +1809,7 @@
                 <w:rFonts w:ascii="宋体" w:hAnsi="宋体" w:eastAsia="宋体"/>
                 <w:sz w:val="19"/>
               </w:rPr>
-              <w:t>4</w:t>
+              <w:t>5</w:t>
             </w:r>
           </w:p>
         </w:tc>
@@ -1931,7 +1931,7 @@
                 <w:rFonts w:ascii="宋体" w:hAnsi="宋体" w:eastAsia="宋体"/>
                 <w:sz w:val="19"/>
               </w:rPr>
-              <w:t>9</w:t>
+              <w:t>12</w:t>
             </w:r>
           </w:p>
         </w:tc>
@@ -2297,7 +2297,7 @@
                 <w:rFonts w:ascii="宋体" w:hAnsi="宋体" w:eastAsia="宋体"/>
                 <w:sz w:val="19"/>
               </w:rPr>
-              <w:t>10</w:t>
+              <w:t>11</w:t>
             </w:r>
           </w:p>
         </w:tc>
@@ -2663,7 +2663,7 @@
                 <w:rFonts w:ascii="宋体" w:hAnsi="宋体" w:eastAsia="宋体"/>
                 <w:sz w:val="19"/>
               </w:rPr>
-              <w:t>12</w:t>
+              <w:t>15</w:t>
             </w:r>
           </w:p>
         </w:tc>
@@ -3151,7 +3151,7 @@
                 <w:rFonts w:ascii="宋体" w:hAnsi="宋体" w:eastAsia="宋体"/>
                 <w:sz w:val="19"/>
               </w:rPr>
-              <w:t>8</w:t>
+              <w:t>9</w:t>
             </w:r>
           </w:p>
         </w:tc>
@@ -3761,7 +3761,7 @@
                 <w:rFonts w:ascii="宋体" w:hAnsi="宋体" w:eastAsia="宋体"/>
                 <w:sz w:val="19"/>
               </w:rPr>
-              <w:t>3</w:t>
+              <w:t>5</w:t>
             </w:r>
           </w:p>
         </w:tc>
@@ -6893,7 +6893,7 @@
                 <w:rFonts w:ascii="宋体" w:hAnsi="宋体" w:eastAsia="宋体"/>
                 <w:sz w:val="19"/>
               </w:rPr>
-              <w:t>12</w:t>
+              <w:t>15</w:t>
             </w:r>
           </w:p>
         </w:tc>
@@ -7015,7 +7015,7 @@
                 <w:rFonts w:ascii="宋体" w:hAnsi="宋体" w:eastAsia="宋体"/>
                 <w:sz w:val="19"/>
               </w:rPr>
-              <w:t>7</w:t>
+              <w:t>6</w:t>
             </w:r>
           </w:p>
         </w:tc>
@@ -7137,7 +7137,7 @@
                 <w:rFonts w:ascii="宋体" w:hAnsi="宋体" w:eastAsia="宋体"/>
                 <w:sz w:val="19"/>
               </w:rPr>
-              <w:t>7</w:t>
+              <w:t>11</w:t>
             </w:r>
           </w:p>
         </w:tc>
@@ -7259,7 +7259,7 @@
                 <w:rFonts w:ascii="宋体" w:hAnsi="宋体" w:eastAsia="宋体"/>
                 <w:sz w:val="19"/>
               </w:rPr>
-              <w:t>4</w:t>
+              <w:t>8</w:t>
             </w:r>
           </w:p>
         </w:tc>
@@ -7747,7 +7747,7 @@
                 <w:rFonts w:ascii="宋体" w:hAnsi="宋体" w:eastAsia="宋体"/>
                 <w:sz w:val="19"/>
               </w:rPr>
-              <w:t>3</w:t>
+              <w:t>2</w:t>
             </w:r>
           </w:p>
         </w:tc>
@@ -8235,7 +8235,7 @@
                 <w:rFonts w:ascii="宋体" w:hAnsi="宋体" w:eastAsia="宋体"/>
                 <w:sz w:val="19"/>
               </w:rPr>
-              <w:t>5</w:t>
+              <w:t>4</w:t>
             </w:r>
           </w:p>
         </w:tc>
@@ -8723,7 +8723,7 @@
                 <w:rFonts w:ascii="宋体" w:hAnsi="宋体" w:eastAsia="宋体"/>
                 <w:sz w:val="19"/>
               </w:rPr>
-              <w:t>1</w:t>
+              <w:t>2</w:t>
             </w:r>
           </w:p>
         </w:tc>
@@ -9293,7 +9293,7 @@
                 <w:rFonts w:ascii="宋体" w:hAnsi="宋体" w:eastAsia="宋体"/>
                 <w:sz w:val="19"/>
               </w:rPr>
-              <w:t>9</w:t>
+              <w:t>11</w:t>
             </w:r>
           </w:p>
         </w:tc>
@@ -9415,7 +9415,7 @@
                 <w:rFonts w:ascii="宋体" w:hAnsi="宋体" w:eastAsia="宋体"/>
                 <w:sz w:val="19"/>
               </w:rPr>
-              <w:t>7</w:t>
+              <w:t>6</w:t>
             </w:r>
           </w:p>
         </w:tc>
@@ -9903,7 +9903,7 @@
                 <w:rFonts w:ascii="宋体" w:hAnsi="宋体" w:eastAsia="宋体"/>
                 <w:sz w:val="19"/>
               </w:rPr>
-              <w:t>6</w:t>
+              <w:t>5</w:t>
             </w:r>
           </w:p>
         </w:tc>
@@ -10269,7 +10269,7 @@
                 <w:rFonts w:ascii="宋体" w:hAnsi="宋体" w:eastAsia="宋体"/>
                 <w:sz w:val="19"/>
               </w:rPr>
-              <w:t>9</w:t>
+              <w:t>14</w:t>
             </w:r>
           </w:p>
         </w:tc>
@@ -10513,7 +10513,7 @@
                 <w:rFonts w:ascii="宋体" w:hAnsi="宋体" w:eastAsia="宋体"/>
                 <w:sz w:val="19"/>
               </w:rPr>
-              <w:t>1</w:t>
+              <w:t>2</w:t>
             </w:r>
           </w:p>
         </w:tc>
@@ -12587,7 +12587,7 @@
                 <w:rFonts w:ascii="宋体" w:hAnsi="宋体" w:eastAsia="宋体"/>
                 <w:sz w:val="19"/>
               </w:rPr>
-              <w:t>1</w:t>
+              <w:t>2</w:t>
             </w:r>
           </w:p>
         </w:tc>
@@ -13929,7 +13929,7 @@
                 <w:rFonts w:ascii="宋体" w:hAnsi="宋体" w:eastAsia="宋体"/>
                 <w:sz w:val="19"/>
               </w:rPr>
-              <w:t>1</w:t>
+              <w:t>2</w:t>
             </w:r>
           </w:p>
         </w:tc>

</xml_diff>